<commit_message>
docs: save Word-normalized version of project report
</commit_message>
<xml_diff>
--- a/docs/GST-Saathi-Report.docx
+++ b/docs/GST-Saathi-Report.docx
@@ -1,6 +1,6 @@
 
 <file path=word/document.xml><?xml version="1.0" encoding="utf-8"?>
-<w:document xmlns:wpc="http://schemas.microsoft.com/office/word/2010/wordprocessingCanvas" xmlns:mc="http://schemas.openxmlformats.org/markup-compatibility/2006" xmlns:o="urn:schemas-microsoft-com:office:office" xmlns:r="http://schemas.openxmlformats.org/officeDocument/2006/relationships" xmlns:m="http://schemas.openxmlformats.org/officeDocument/2006/math" xmlns:v="urn:schemas-microsoft-com:vml" xmlns:wp14="http://schemas.microsoft.com/office/word/2010/wordprocessingDrawing" xmlns:wp="http://schemas.openxmlformats.org/drawingml/2006/wordprocessingDrawing" xmlns:w10="urn:schemas-microsoft-com:office:word" xmlns:w="http://schemas.openxmlformats.org/wordprocessingml/2006/main" xmlns:w14="http://schemas.microsoft.com/office/word/2010/wordml" xmlns:w15="http://schemas.microsoft.com/office/word/2012/wordml" xmlns:wpg="http://schemas.microsoft.com/office/word/2010/wordprocessingGroup" xmlns:wpi="http://schemas.microsoft.com/office/word/2010/wordprocessingInk" xmlns:wne="http://schemas.microsoft.com/office/word/2006/wordml" xmlns:wps="http://schemas.microsoft.com/office/word/2010/wordprocessingShape" xmlns:cx="http://schemas.microsoft.com/office/drawing/2014/chartex" xmlns:cx1="http://schemas.microsoft.com/office/drawing/2015/9/8/chartex" xmlns:cx2="http://schemas.microsoft.com/office/drawing/2015/10/21/chartex" xmlns:cx3="http://schemas.microsoft.com/office/drawing/2016/5/9/chartex" xmlns:cx4="http://schemas.microsoft.com/office/drawing/2016/5/10/chartex" xmlns:cx5="http://schemas.microsoft.com/office/drawing/2016/5/11/chartex" xmlns:cx6="http://schemas.microsoft.com/office/drawing/2016/5/12/chartex" xmlns:cx7="http://schemas.microsoft.com/office/drawing/2016/5/13/chartex" xmlns:cx8="http://schemas.microsoft.com/office/drawing/2016/5/14/chartex" xmlns:aink="http://schemas.microsoft.com/office/drawing/2016/ink" xmlns:am3d="http://schemas.microsoft.com/office/drawing/2017/model3d" xmlns:w16cex="http://schemas.microsoft.com/office/word/2018/wordml/cex" xmlns:w16cid="http://schemas.microsoft.com/office/word/2016/wordml/cid" xmlns:w16="http://schemas.microsoft.com/office/word/2018/wordml" xmlns:w16sdtdh="http://schemas.microsoft.com/office/word/2020/wordml/sdtdatahash" xmlns:w16se="http://schemas.microsoft.com/office/word/2015/wordml/symex" mc:Ignorable="w14 w15 wp14">
+<w:document xmlns:wpc="http://schemas.microsoft.com/office/word/2010/wordprocessingCanvas" xmlns:cx="http://schemas.microsoft.com/office/drawing/2014/chartex" xmlns:cx1="http://schemas.microsoft.com/office/drawing/2015/9/8/chartex" xmlns:cx2="http://schemas.microsoft.com/office/drawing/2015/10/21/chartex" xmlns:cx3="http://schemas.microsoft.com/office/drawing/2016/5/9/chartex" xmlns:cx4="http://schemas.microsoft.com/office/drawing/2016/5/10/chartex" xmlns:cx5="http://schemas.microsoft.com/office/drawing/2016/5/11/chartex" xmlns:cx6="http://schemas.microsoft.com/office/drawing/2016/5/12/chartex" xmlns:cx7="http://schemas.microsoft.com/office/drawing/2016/5/13/chartex" xmlns:cx8="http://schemas.microsoft.com/office/drawing/2016/5/14/chartex" xmlns:mc="http://schemas.openxmlformats.org/markup-compatibility/2006" xmlns:aink="http://schemas.microsoft.com/office/drawing/2016/ink" xmlns:am3d="http://schemas.microsoft.com/office/drawing/2017/model3d" xmlns:o="urn:schemas-microsoft-com:office:office" xmlns:oel="http://schemas.microsoft.com/office/2019/extlst" xmlns:r="http://schemas.openxmlformats.org/officeDocument/2006/relationships" xmlns:m="http://schemas.openxmlformats.org/officeDocument/2006/math" xmlns:v="urn:schemas-microsoft-com:vml" xmlns:wp14="http://schemas.microsoft.com/office/word/2010/wordprocessingDrawing" xmlns:wp="http://schemas.openxmlformats.org/drawingml/2006/wordprocessingDrawing" xmlns:w10="urn:schemas-microsoft-com:office:word" xmlns:w="http://schemas.openxmlformats.org/wordprocessingml/2006/main" xmlns:w14="http://schemas.microsoft.com/office/word/2010/wordml" xmlns:w15="http://schemas.microsoft.com/office/word/2012/wordml" xmlns:w16cex="http://schemas.microsoft.com/office/word/2018/wordml/cex" xmlns:w16cid="http://schemas.microsoft.com/office/word/2016/wordml/cid" xmlns:w16="http://schemas.microsoft.com/office/word/2018/wordml" xmlns:w16du="http://schemas.microsoft.com/office/word/2023/wordml/word16du" xmlns:w16sdtdh="http://schemas.microsoft.com/office/word/2020/wordml/sdtdatahash" xmlns:w16sdtfl="http://schemas.microsoft.com/office/word/2024/wordml/sdtformatlock" xmlns:w16se="http://schemas.microsoft.com/office/word/2015/wordml/symex" xmlns:wpg="http://schemas.microsoft.com/office/word/2010/wordprocessingGroup" xmlns:wpi="http://schemas.microsoft.com/office/word/2010/wordprocessingInk" xmlns:wne="http://schemas.microsoft.com/office/word/2006/wordml" xmlns:wps="http://schemas.microsoft.com/office/word/2010/wordprocessingShape" mc:Ignorable="w14 w15 w16se w16cid w16 w16cex w16sdtdh w16sdtfl w16du wp14">
   <w:body>
     <w:p>
       <w:pPr>
@@ -8,7 +8,7 @@
         <w:spacing w:after="120"/>
       </w:pPr>
       <w:r>
-        <w:t xml:space="preserve">GST Saathi — Project Report</w:t>
+        <w:t>GST Saathi — Project Report</w:t>
       </w:r>
     </w:p>
     <w:p>
@@ -20,7 +20,7 @@
           <w:b/>
           <w:bCs/>
         </w:rPr>
-        <w:t xml:space="preserve">Course project (AI course)</w:t>
+        <w:t>Course project (AI course)</w:t>
       </w:r>
     </w:p>
     <w:p>
@@ -32,7 +32,7 @@
           <w:b/>
           <w:bCs/>
         </w:rPr>
-        <w:t xml:space="preserve">Team: Aksh Juneja, Shruti Agnihotri</w:t>
+        <w:t>Team: Aksh Juneja, Shruti Agnihotri</w:t>
       </w:r>
     </w:p>
     <w:p>
@@ -46,12 +46,12 @@
         </w:rPr>
         <w:t xml:space="preserve">Repository: </w:t>
       </w:r>
-      <w:hyperlink w:history="1" r:id="rIdhxrgo-qqqovd5mplccp1o">
+      <w:hyperlink r:id="rId5" w:history="1">
         <w:r>
           <w:rPr>
             <w:rStyle w:val="Hyperlink"/>
           </w:rPr>
-          <w:t xml:space="preserve">https://github.com/Aksh28/gst-saathi</w:t>
+          <w:t>https://github.com/Aksh28/gst-saathi</w:t>
         </w:r>
       </w:hyperlink>
     </w:p>
@@ -64,13 +64,13 @@
           <w:b/>
           <w:bCs/>
         </w:rPr>
-        <w:t xml:space="preserve">Submission date: 25 October 2026</w:t>
+        <w:t>Submission date: 25 October 2026</w:t>
       </w:r>
     </w:p>
     <w:p>
       <w:pPr>
         <w:pBdr>
-          <w:bottom w:val="single" w:color="CCCCCC" w:sz="6" w:space="1"/>
+          <w:bottom w:val="single" w:sz="6" w:space="1" w:color="CCCCCC"/>
         </w:pBdr>
         <w:spacing w:after="240"/>
       </w:pPr>
@@ -78,10 +78,10 @@
     <w:p>
       <w:pPr>
         <w:pStyle w:val="Heading1"/>
-        <w:spacing w:after="160" w:before="360"/>
-      </w:pPr>
-      <w:r>
-        <w:t xml:space="preserve">1. Executive Summary</w:t>
+        <w:spacing w:before="360" w:after="160"/>
+      </w:pPr>
+      <w:r>
+        <w:t>1. Executive Summary</w:t>
       </w:r>
     </w:p>
     <w:p>
@@ -89,7 +89,7 @@
         <w:spacing w:after="160"/>
       </w:pPr>
       <w:r>
-        <w:t xml:space="preserve">GST Saathi is an AI-powered tool that explains Indian GST (Goods and Services Tax) filings, invoices, and department notices in plain, jargon-free language for small shopkeepers. This submission is v1 (Explainer): a working prototype that takes GST-related text and returns a plain-language explanation. A second mode, Auditor (cross-checking a filing against a shopkeeper’s real invoices to catch errors), is scoped as future work and is intentionally not part of this build — the reasoning for that scope line is in Section 6.</w:t>
+        <w:t>GST Saathi is an AI-powered tool that explains Indian GST (Goods and Services Tax) filings, invoices, and department notices in plain, jargon-free language for small shopkeepers. This submission is v1 (Explainer): a working prototype that takes GST-related text and returns a plain-language explanation. A second mode, Auditor (cross-checking a filing against a shopkeeper’s real invoices to catch errors), is scoped as future work and is intentionally not part of this build — the reasoning for that scope line is in Section 6.</w:t>
       </w:r>
     </w:p>
     <w:p>
@@ -97,16 +97,16 @@
         <w:spacing w:after="160"/>
       </w:pPr>
       <w:r>
-        <w:t xml:space="preserve">The long-term goal is not purely academic: the problem is real, evidence of it is strong, and the intention is to keep building this into a product small shopkeepers would actually pay for, beyond the course deadline.</w:t>
+        <w:t>The long-term goal is not purely academic: the problem is real, evidence of it is strong, and the intention is to keep building this into a product small shopkeepers would actually pay for, beyond the course deadline.</w:t>
       </w:r>
     </w:p>
     <w:p>
       <w:pPr>
         <w:pStyle w:val="Heading1"/>
-        <w:spacing w:after="160" w:before="360"/>
-      </w:pPr>
-      <w:r>
-        <w:t xml:space="preserve">2. Problem Statement</w:t>
+        <w:spacing w:before="360" w:after="160"/>
+      </w:pPr>
+      <w:r>
+        <w:t>2. Problem Statement</w:t>
       </w:r>
     </w:p>
     <w:p>
@@ -114,7 +114,7 @@
         <w:spacing w:after="160"/>
       </w:pPr>
       <w:r>
-        <w:t xml:space="preserve">Small and medium shopkeepers in India are legally required to file GST returns, but almost none of them do it themselves. They hire a Chartered Accountant (CA) to handle the filing and have no independent way to verify what was filed in their name, whether it was filed correctly, or what it actually means for their money.</w:t>
+        <w:t>Small and medium shopkeepers in India are legally required to file GST returns, but almost none of them do it themselves. They hire a Chartered Accountant (CA) to handle the filing and have no independent way to verify what was filed in their name, whether it was filed correctly, or what it actually means for their money.</w:t>
       </w:r>
     </w:p>
     <w:p>
@@ -122,7 +122,7 @@
         <w:spacing w:after="160"/>
       </w:pPr>
       <w:r>
-        <w:t xml:space="preserve">This is not a hypothetical problem. Industry reporting on small-business GST compliance (a study of small-business practices around Bengaluru CA firms) found that 77% of small businesses depend entirely on their accountant for GST, with no verification step of their own, and that reconciling Input Tax Credit (ITC) — the credit a business can claim back on tax it already paid to its suppliers — is consistently the single hardest part of the process for them to understand. GST rule changes (such as the September 2025 rate-cut pass-through) have also generated visible waves of consumer and small-business confusion and complaints.</w:t>
+        <w:t>This is not a hypothetical problem. Industry reporting on small-business GST compliance (a study of small-business practices around Bengaluru CA firms) found that 77% of small businesses depend entirely on their accountant for GST, with no verification step of their own, and that reconciling Input Tax Credit (ITC) — the credit a business can claim back on tax it already paid to its suppliers — is consistently the single hardest part of the process for them to understand. GST rule changes (such as the September 2025 rate-cut pass-through) have also generated visible waves of consumer and small-business confusion and complaints.</w:t>
       </w:r>
     </w:p>
     <w:p>
@@ -130,16 +130,16 @@
         <w:spacing w:after="160"/>
       </w:pPr>
       <w:r>
-        <w:t xml:space="preserve">The core failure is not that filing tools don’t exist — it’s that existing tools solve the wrong side of the problem.</w:t>
+        <w:t>The core failure is not that filing tools don’t exist — it’s that existing tools solve the wrong side of the problem.</w:t>
       </w:r>
     </w:p>
     <w:p>
       <w:pPr>
         <w:pStyle w:val="Heading1"/>
-        <w:spacing w:after="160" w:before="360"/>
-      </w:pPr>
-      <w:r>
-        <w:t xml:space="preserve">3. Market and Target Users</w:t>
+        <w:spacing w:before="360" w:after="160"/>
+      </w:pPr>
+      <w:r>
+        <w:t>3. Market and Target Users</w:t>
       </w:r>
     </w:p>
     <w:p>
@@ -147,7 +147,7 @@
         <w:spacing w:after="160"/>
       </w:pPr>
       <w:r>
-        <w:t xml:space="preserve">Primary user: a small shopkeeper or micro-business owner in India who files GST exclusively through a CA and cannot read, verify, or make sense of the filing documents themselves.</w:t>
+        <w:t>Primary user: a small shopkeeper or micro-business owner in India who files GST exclusively through a CA and cannot read, verify, or make sense of the filing documents themselves.</w:t>
       </w:r>
     </w:p>
     <w:p>
@@ -155,45 +155,46 @@
         <w:spacing w:after="160"/>
       </w:pPr>
       <w:r>
-        <w:t xml:space="preserve">Market size context: India has tens of millions of GST-registered small businesses, the overwhelming majority of which are CA-dependent for compliance (per the 77% figure above). This is a large, recurring-need market — GST filing happens monthly, not once.</w:t>
+        <w:t>Market size context: India has tens of millions of GST-registered small businesses, the overwhelming majority of which are CA-dependent for compliance (per the 77% figure above). This is a large, recurring-need market — GST filing happens monthly, not once.</w:t>
       </w:r>
     </w:p>
     <w:p>
       <w:pPr>
         <w:pStyle w:val="Heading2"/>
-        <w:spacing w:after="120" w:before="280"/>
-      </w:pPr>
-      <w:r>
-        <w:t xml:space="preserve">Existing competition and why it doesn’t solve this</w:t>
+        <w:spacing w:before="280" w:after="120"/>
+      </w:pPr>
+      <w:r>
+        <w:t>Existing competition and why it doesn’t solve this</w:t>
       </w:r>
     </w:p>
     <w:tbl>
       <w:tblPr>
-        <w:tblW w:type="dxa" w:w="10080"/>
+        <w:tblW w:w="10080" w:type="dxa"/>
         <w:tblBorders>
-          <w:top w:val="single" w:color="auto" w:sz="4"/>
-          <w:left w:val="single" w:color="auto" w:sz="4"/>
-          <w:bottom w:val="single" w:color="auto" w:sz="4"/>
-          <w:right w:val="single" w:color="auto" w:sz="4"/>
-          <w:insideH w:val="single" w:color="auto" w:sz="4"/>
-          <w:insideV w:val="single" w:color="auto" w:sz="4"/>
+          <w:top w:val="single" w:sz="4" w:space="0" w:color="auto"/>
+          <w:left w:val="single" w:sz="4" w:space="0" w:color="auto"/>
+          <w:bottom w:val="single" w:sz="4" w:space="0" w:color="auto"/>
+          <w:right w:val="single" w:sz="4" w:space="0" w:color="auto"/>
+          <w:insideH w:val="single" w:sz="4" w:space="0" w:color="auto"/>
+          <w:insideV w:val="single" w:sz="4" w:space="0" w:color="auto"/>
         </w:tblBorders>
+        <w:tblLook w:val="04A0" w:firstRow="1" w:lastRow="0" w:firstColumn="1" w:lastColumn="0" w:noHBand="0" w:noVBand="1"/>
       </w:tblPr>
       <w:tblGrid>
-        <w:gridCol w:w="2600"/>
-        <w:gridCol w:w="3380"/>
-        <w:gridCol w:w="3380"/>
+        <w:gridCol w:w="2800"/>
+        <w:gridCol w:w="3640"/>
+        <w:gridCol w:w="3640"/>
       </w:tblGrid>
       <w:tr>
         <w:tc>
           <w:tcPr>
-            <w:tcW w:type="dxa" w:w="2600"/>
-            <w:shd w:fill="2F3B52" w:color="auto" w:val="clear"/>
-            <w:tcMar>
-              <w:top w:type="dxa" w:w="80"/>
-              <w:left w:type="dxa" w:w="100"/>
-              <w:bottom w:type="dxa" w:w="80"/>
-              <w:right w:type="dxa" w:w="100"/>
+            <w:tcW w:w="2600" w:type="dxa"/>
+            <w:shd w:val="clear" w:color="auto" w:fill="2F3B52"/>
+            <w:tcMar>
+              <w:top w:w="80" w:type="dxa"/>
+              <w:left w:w="100" w:type="dxa"/>
+              <w:bottom w:w="80" w:type="dxa"/>
+              <w:right w:w="100" w:type="dxa"/>
             </w:tcMar>
           </w:tcPr>
           <w:p>
@@ -205,19 +206,19 @@
                 <w:sz w:val="20"/>
                 <w:szCs w:val="20"/>
               </w:rPr>
-              <w:t xml:space="preserve">Tool</w:t>
-            </w:r>
-          </w:p>
-        </w:tc>
-        <w:tc>
-          <w:tcPr>
-            <w:tcW w:type="dxa" w:w="3380"/>
-            <w:shd w:fill="2F3B52" w:color="auto" w:val="clear"/>
-            <w:tcMar>
-              <w:top w:type="dxa" w:w="80"/>
-              <w:left w:type="dxa" w:w="100"/>
-              <w:bottom w:type="dxa" w:w="80"/>
-              <w:right w:type="dxa" w:w="100"/>
+              <w:t>Tool</w:t>
+            </w:r>
+          </w:p>
+        </w:tc>
+        <w:tc>
+          <w:tcPr>
+            <w:tcW w:w="3380" w:type="dxa"/>
+            <w:shd w:val="clear" w:color="auto" w:fill="2F3B52"/>
+            <w:tcMar>
+              <w:top w:w="80" w:type="dxa"/>
+              <w:left w:w="100" w:type="dxa"/>
+              <w:bottom w:w="80" w:type="dxa"/>
+              <w:right w:w="100" w:type="dxa"/>
             </w:tcMar>
           </w:tcPr>
           <w:p>
@@ -229,19 +230,19 @@
                 <w:sz w:val="20"/>
                 <w:szCs w:val="20"/>
               </w:rPr>
-              <w:t xml:space="preserve">What it solves</w:t>
-            </w:r>
-          </w:p>
-        </w:tc>
-        <w:tc>
-          <w:tcPr>
-            <w:tcW w:type="dxa" w:w="3380"/>
-            <w:shd w:fill="2F3B52" w:color="auto" w:val="clear"/>
-            <w:tcMar>
-              <w:top w:type="dxa" w:w="80"/>
-              <w:left w:type="dxa" w:w="100"/>
-              <w:bottom w:type="dxa" w:w="80"/>
-              <w:right w:type="dxa" w:w="100"/>
+              <w:t>What it solves</w:t>
+            </w:r>
+          </w:p>
+        </w:tc>
+        <w:tc>
+          <w:tcPr>
+            <w:tcW w:w="3380" w:type="dxa"/>
+            <w:shd w:val="clear" w:color="auto" w:fill="2F3B52"/>
+            <w:tcMar>
+              <w:top w:w="80" w:type="dxa"/>
+              <w:left w:w="100" w:type="dxa"/>
+              <w:bottom w:w="80" w:type="dxa"/>
+              <w:right w:w="100" w:type="dxa"/>
             </w:tcMar>
           </w:tcPr>
           <w:p>
@@ -253,7 +254,7 @@
                 <w:sz w:val="20"/>
                 <w:szCs w:val="20"/>
               </w:rPr>
-              <w:t xml:space="preserve">What it doesn’t solve</w:t>
+              <w:t>What it doesn’t solve</w:t>
             </w:r>
           </w:p>
         </w:tc>
@@ -261,70 +262,64 @@
       <w:tr>
         <w:tc>
           <w:tcPr>
-            <w:tcW w:type="dxa" w:w="2600"/>
-            <w:tcMar>
-              <w:top w:type="dxa" w:w="80"/>
-              <w:left w:type="dxa" w:w="100"/>
-              <w:bottom w:type="dxa" w:w="80"/>
-              <w:right w:type="dxa" w:w="100"/>
-            </w:tcMar>
-          </w:tcPr>
-          <w:p>
-            <w:r>
-              <w:rPr>
-                <w:b w:val="false"/>
-                <w:bCs w:val="false"/>
+            <w:tcW w:w="2600" w:type="dxa"/>
+            <w:tcMar>
+              <w:top w:w="80" w:type="dxa"/>
+              <w:left w:w="100" w:type="dxa"/>
+              <w:bottom w:w="80" w:type="dxa"/>
+              <w:right w:w="100" w:type="dxa"/>
+            </w:tcMar>
+          </w:tcPr>
+          <w:p>
+            <w:r>
+              <w:rPr>
                 <w:color w:val="000000"/>
                 <w:sz w:val="20"/>
                 <w:szCs w:val="20"/>
               </w:rPr>
-              <w:t xml:space="preserve">ClearTax, Zoho Books, Tally</w:t>
-            </w:r>
-          </w:p>
-        </w:tc>
-        <w:tc>
-          <w:tcPr>
-            <w:tcW w:type="dxa" w:w="3380"/>
-            <w:tcMar>
-              <w:top w:type="dxa" w:w="80"/>
-              <w:left w:type="dxa" w:w="100"/>
-              <w:bottom w:type="dxa" w:w="80"/>
-              <w:right w:type="dxa" w:w="100"/>
-            </w:tcMar>
-          </w:tcPr>
-          <w:p>
-            <w:r>
-              <w:rPr>
-                <w:b w:val="false"/>
-                <w:bCs w:val="false"/>
+              <w:t>ClearTax, Zoho Books, Tally</w:t>
+            </w:r>
+          </w:p>
+        </w:tc>
+        <w:tc>
+          <w:tcPr>
+            <w:tcW w:w="3380" w:type="dxa"/>
+            <w:tcMar>
+              <w:top w:w="80" w:type="dxa"/>
+              <w:left w:w="100" w:type="dxa"/>
+              <w:bottom w:w="80" w:type="dxa"/>
+              <w:right w:w="100" w:type="dxa"/>
+            </w:tcMar>
+          </w:tcPr>
+          <w:p>
+            <w:r>
+              <w:rPr>
                 <w:color w:val="000000"/>
                 <w:sz w:val="20"/>
                 <w:szCs w:val="20"/>
               </w:rPr>
-              <w:t xml:space="preserve">Filing mechanics for the CA/business</w:t>
-            </w:r>
-          </w:p>
-        </w:tc>
-        <w:tc>
-          <w:tcPr>
-            <w:tcW w:type="dxa" w:w="3380"/>
-            <w:tcMar>
-              <w:top w:type="dxa" w:w="80"/>
-              <w:left w:type="dxa" w:w="100"/>
-              <w:bottom w:type="dxa" w:w="80"/>
-              <w:right w:type="dxa" w:w="100"/>
-            </w:tcMar>
-          </w:tcPr>
-          <w:p>
-            <w:r>
-              <w:rPr>
-                <w:b w:val="false"/>
-                <w:bCs w:val="false"/>
+              <w:t>Filing mechanics for the CA/business</w:t>
+            </w:r>
+          </w:p>
+        </w:tc>
+        <w:tc>
+          <w:tcPr>
+            <w:tcW w:w="3380" w:type="dxa"/>
+            <w:tcMar>
+              <w:top w:w="80" w:type="dxa"/>
+              <w:left w:w="100" w:type="dxa"/>
+              <w:bottom w:w="80" w:type="dxa"/>
+              <w:right w:w="100" w:type="dxa"/>
+            </w:tcMar>
+          </w:tcPr>
+          <w:p>
+            <w:r>
+              <w:rPr>
                 <w:color w:val="000000"/>
                 <w:sz w:val="20"/>
                 <w:szCs w:val="20"/>
               </w:rPr>
-              <w:t xml:space="preserve">Whether the shopkeeper understands or trusts what was filed</w:t>
+              <w:t>Whether the shopkeeper understands or trusts what was filed</w:t>
             </w:r>
           </w:p>
         </w:tc>
@@ -332,70 +327,65 @@
       <w:tr>
         <w:tc>
           <w:tcPr>
-            <w:tcW w:type="dxa" w:w="2600"/>
-            <w:tcMar>
-              <w:top w:type="dxa" w:w="80"/>
-              <w:left w:type="dxa" w:w="100"/>
-              <w:bottom w:type="dxa" w:w="80"/>
-              <w:right w:type="dxa" w:w="100"/>
-            </w:tcMar>
-          </w:tcPr>
-          <w:p>
-            <w:r>
-              <w:rPr>
-                <w:b w:val="false"/>
-                <w:bCs w:val="false"/>
+            <w:tcW w:w="2600" w:type="dxa"/>
+            <w:tcMar>
+              <w:top w:w="80" w:type="dxa"/>
+              <w:left w:w="100" w:type="dxa"/>
+              <w:bottom w:w="80" w:type="dxa"/>
+              <w:right w:w="100" w:type="dxa"/>
+            </w:tcMar>
+          </w:tcPr>
+          <w:p>
+            <w:r>
+              <w:rPr>
                 <w:color w:val="000000"/>
                 <w:sz w:val="20"/>
                 <w:szCs w:val="20"/>
               </w:rPr>
-              <w:t xml:space="preserve">Generic chatbots / search</w:t>
-            </w:r>
-          </w:p>
-        </w:tc>
-        <w:tc>
-          <w:tcPr>
-            <w:tcW w:type="dxa" w:w="3380"/>
-            <w:tcMar>
-              <w:top w:type="dxa" w:w="80"/>
-              <w:left w:type="dxa" w:w="100"/>
-              <w:bottom w:type="dxa" w:w="80"/>
-              <w:right w:type="dxa" w:w="100"/>
-            </w:tcMar>
-          </w:tcPr>
-          <w:p>
-            <w:r>
-              <w:rPr>
-                <w:b w:val="false"/>
-                <w:bCs w:val="false"/>
+              <w:lastRenderedPageBreak/>
+              <w:t>Generic chatbots / search</w:t>
+            </w:r>
+          </w:p>
+        </w:tc>
+        <w:tc>
+          <w:tcPr>
+            <w:tcW w:w="3380" w:type="dxa"/>
+            <w:tcMar>
+              <w:top w:w="80" w:type="dxa"/>
+              <w:left w:w="100" w:type="dxa"/>
+              <w:bottom w:w="80" w:type="dxa"/>
+              <w:right w:w="100" w:type="dxa"/>
+            </w:tcMar>
+          </w:tcPr>
+          <w:p>
+            <w:r>
+              <w:rPr>
                 <w:color w:val="000000"/>
                 <w:sz w:val="20"/>
                 <w:szCs w:val="20"/>
               </w:rPr>
-              <w:t xml:space="preserve">General tax Q&amp;A</w:t>
-            </w:r>
-          </w:p>
-        </w:tc>
-        <w:tc>
-          <w:tcPr>
-            <w:tcW w:type="dxa" w:w="3380"/>
-            <w:tcMar>
-              <w:top w:type="dxa" w:w="80"/>
-              <w:left w:type="dxa" w:w="100"/>
-              <w:bottom w:type="dxa" w:w="80"/>
-              <w:right w:type="dxa" w:w="100"/>
-            </w:tcMar>
-          </w:tcPr>
-          <w:p>
-            <w:r>
-              <w:rPr>
-                <w:b w:val="false"/>
-                <w:bCs w:val="false"/>
+              <w:t>General tax Q&amp;A</w:t>
+            </w:r>
+          </w:p>
+        </w:tc>
+        <w:tc>
+          <w:tcPr>
+            <w:tcW w:w="3380" w:type="dxa"/>
+            <w:tcMar>
+              <w:top w:w="80" w:type="dxa"/>
+              <w:left w:w="100" w:type="dxa"/>
+              <w:bottom w:w="80" w:type="dxa"/>
+              <w:right w:w="100" w:type="dxa"/>
+            </w:tcMar>
+          </w:tcPr>
+          <w:p>
+            <w:r>
+              <w:rPr>
                 <w:color w:val="000000"/>
                 <w:sz w:val="20"/>
                 <w:szCs w:val="20"/>
               </w:rPr>
-              <w:t xml:space="preserve">Explaining this specific filing document, in context</w:t>
+              <w:t>Explaining this specific filing document, in context</w:t>
             </w:r>
           </w:p>
         </w:tc>
@@ -403,70 +393,64 @@
       <w:tr>
         <w:tc>
           <w:tcPr>
-            <w:tcW w:type="dxa" w:w="2600"/>
-            <w:tcMar>
-              <w:top w:type="dxa" w:w="80"/>
-              <w:left w:type="dxa" w:w="100"/>
-              <w:bottom w:type="dxa" w:w="80"/>
-              <w:right w:type="dxa" w:w="100"/>
-            </w:tcMar>
-          </w:tcPr>
-          <w:p>
-            <w:r>
-              <w:rPr>
-                <w:b w:val="false"/>
-                <w:bCs w:val="false"/>
+            <w:tcW w:w="2600" w:type="dxa"/>
+            <w:tcMar>
+              <w:top w:w="80" w:type="dxa"/>
+              <w:left w:w="100" w:type="dxa"/>
+              <w:bottom w:w="80" w:type="dxa"/>
+              <w:right w:w="100" w:type="dxa"/>
+            </w:tcMar>
+          </w:tcPr>
+          <w:p>
+            <w:r>
+              <w:rPr>
                 <w:color w:val="000000"/>
                 <w:sz w:val="20"/>
                 <w:szCs w:val="20"/>
               </w:rPr>
-              <w:t xml:space="preserve">Insurance-claim-dispute startups (Insurance Samadhan, ClaimBuddy, etc.)</w:t>
-            </w:r>
-          </w:p>
-        </w:tc>
-        <w:tc>
-          <w:tcPr>
-            <w:tcW w:type="dxa" w:w="3380"/>
-            <w:tcMar>
-              <w:top w:type="dxa" w:w="80"/>
-              <w:left w:type="dxa" w:w="100"/>
-              <w:bottom w:type="dxa" w:w="80"/>
-              <w:right w:type="dxa" w:w="100"/>
-            </w:tcMar>
-          </w:tcPr>
-          <w:p>
-            <w:r>
-              <w:rPr>
-                <w:b w:val="false"/>
-                <w:bCs w:val="false"/>
+              <w:t>Insurance-claim-dispute startups (Insurance Samadhan, ClaimBuddy, etc.)</w:t>
+            </w:r>
+          </w:p>
+        </w:tc>
+        <w:tc>
+          <w:tcPr>
+            <w:tcW w:w="3380" w:type="dxa"/>
+            <w:tcMar>
+              <w:top w:w="80" w:type="dxa"/>
+              <w:left w:w="100" w:type="dxa"/>
+              <w:bottom w:w="80" w:type="dxa"/>
+              <w:right w:w="100" w:type="dxa"/>
+            </w:tcMar>
+          </w:tcPr>
+          <w:p>
+            <w:r>
+              <w:rPr>
                 <w:color w:val="000000"/>
                 <w:sz w:val="20"/>
                 <w:szCs w:val="20"/>
               </w:rPr>
-              <w:t xml:space="preserve">A similar “person vs. confusing paperwork” problem, but in insurance</w:t>
-            </w:r>
-          </w:p>
-        </w:tc>
-        <w:tc>
-          <w:tcPr>
-            <w:tcW w:type="dxa" w:w="3380"/>
-            <w:tcMar>
-              <w:top w:type="dxa" w:w="80"/>
-              <w:left w:type="dxa" w:w="100"/>
-              <w:bottom w:type="dxa" w:w="80"/>
-              <w:right w:type="dxa" w:w="100"/>
-            </w:tcMar>
-          </w:tcPr>
-          <w:p>
-            <w:r>
-              <w:rPr>
-                <w:b w:val="false"/>
-                <w:bCs w:val="false"/>
+              <w:t>A similar “person vs. confusing paperwork” problem, but in insurance</w:t>
+            </w:r>
+          </w:p>
+        </w:tc>
+        <w:tc>
+          <w:tcPr>
+            <w:tcW w:w="3380" w:type="dxa"/>
+            <w:tcMar>
+              <w:top w:w="80" w:type="dxa"/>
+              <w:left w:w="100" w:type="dxa"/>
+              <w:bottom w:w="80" w:type="dxa"/>
+              <w:right w:w="100" w:type="dxa"/>
+            </w:tcMar>
+          </w:tcPr>
+          <w:p>
+            <w:r>
+              <w:rPr>
                 <w:color w:val="000000"/>
                 <w:sz w:val="20"/>
                 <w:szCs w:val="20"/>
               </w:rPr>
-              <w:t xml:space="preserve">Different domain; already well-funded and saturated — validated the pattern, not a competitor here</w:t>
+              <w:t>Different domain; already well-funded and saturated — validated the pattern, not a competitor here</w:t>
             </w:r>
           </w:p>
         </w:tc>
@@ -474,70 +458,64 @@
       <w:tr>
         <w:tc>
           <w:tcPr>
-            <w:tcW w:type="dxa" w:w="2600"/>
-            <w:tcMar>
-              <w:top w:type="dxa" w:w="80"/>
-              <w:left w:type="dxa" w:w="100"/>
-              <w:bottom w:type="dxa" w:w="80"/>
-              <w:right w:type="dxa" w:w="100"/>
-            </w:tcMar>
-          </w:tcPr>
-          <w:p>
-            <w:r>
-              <w:rPr>
-                <w:b w:val="false"/>
-                <w:bCs w:val="false"/>
+            <w:tcW w:w="2600" w:type="dxa"/>
+            <w:tcMar>
+              <w:top w:w="80" w:type="dxa"/>
+              <w:left w:w="100" w:type="dxa"/>
+              <w:bottom w:w="80" w:type="dxa"/>
+              <w:right w:w="100" w:type="dxa"/>
+            </w:tcMar>
+          </w:tcPr>
+          <w:p>
+            <w:r>
+              <w:rPr>
                 <w:color w:val="000000"/>
                 <w:sz w:val="20"/>
                 <w:szCs w:val="20"/>
               </w:rPr>
-              <w:t xml:space="preserve">Government scheme-discovery tools (Haqdarshak, etc.)</w:t>
-            </w:r>
-          </w:p>
-        </w:tc>
-        <w:tc>
-          <w:tcPr>
-            <w:tcW w:type="dxa" w:w="3380"/>
-            <w:tcMar>
-              <w:top w:type="dxa" w:w="80"/>
-              <w:left w:type="dxa" w:w="100"/>
-              <w:bottom w:type="dxa" w:w="80"/>
-              <w:right w:type="dxa" w:w="100"/>
-            </w:tcMar>
-          </w:tcPr>
-          <w:p>
-            <w:r>
-              <w:rPr>
-                <w:b w:val="false"/>
-                <w:bCs w:val="false"/>
+              <w:t>Government scheme-discovery tools (Haqdarshak, etc.)</w:t>
+            </w:r>
+          </w:p>
+        </w:tc>
+        <w:tc>
+          <w:tcPr>
+            <w:tcW w:w="3380" w:type="dxa"/>
+            <w:tcMar>
+              <w:top w:w="80" w:type="dxa"/>
+              <w:left w:w="100" w:type="dxa"/>
+              <w:bottom w:w="80" w:type="dxa"/>
+              <w:right w:w="100" w:type="dxa"/>
+            </w:tcMar>
+          </w:tcPr>
+          <w:p>
+            <w:r>
+              <w:rPr>
                 <w:color w:val="000000"/>
                 <w:sz w:val="20"/>
                 <w:szCs w:val="20"/>
               </w:rPr>
-              <w:t xml:space="preserve">Benefit discovery for individuals</w:t>
-            </w:r>
-          </w:p>
-        </w:tc>
-        <w:tc>
-          <w:tcPr>
-            <w:tcW w:type="dxa" w:w="3380"/>
-            <w:tcMar>
-              <w:top w:type="dxa" w:w="80"/>
-              <w:left w:type="dxa" w:w="100"/>
-              <w:bottom w:type="dxa" w:w="80"/>
-              <w:right w:type="dxa" w:w="100"/>
-            </w:tcMar>
-          </w:tcPr>
-          <w:p>
-            <w:r>
-              <w:rPr>
-                <w:b w:val="false"/>
-                <w:bCs w:val="false"/>
+              <w:t>Benefit discovery for individuals</w:t>
+            </w:r>
+          </w:p>
+        </w:tc>
+        <w:tc>
+          <w:tcPr>
+            <w:tcW w:w="3380" w:type="dxa"/>
+            <w:tcMar>
+              <w:top w:w="80" w:type="dxa"/>
+              <w:left w:w="100" w:type="dxa"/>
+              <w:bottom w:w="80" w:type="dxa"/>
+              <w:right w:w="100" w:type="dxa"/>
+            </w:tcMar>
+          </w:tcPr>
+          <w:p>
+            <w:r>
+              <w:rPr>
                 <w:color w:val="000000"/>
                 <w:sz w:val="20"/>
                 <w:szCs w:val="20"/>
               </w:rPr>
-              <w:t xml:space="preserve">Different domain (welfare, not GST); also validated the pattern</w:t>
+              <w:t>Different domain (welfare, not GST); also validated the pattern</w:t>
             </w:r>
           </w:p>
         </w:tc>
@@ -553,16 +531,16 @@
         <w:spacing w:after="160"/>
       </w:pPr>
       <w:r>
-        <w:t xml:space="preserve">No existing product was found that sits on the shopkeeper’s side of the GST relationship and simply explains, in their own language, what their accountant filed. That is the specific gap GST Saathi targets.</w:t>
+        <w:t>No existing product was found that sits on the shopkeeper’s side of the GST relationship and simply explains, in their own language, what their accountant filed. That is the specific gap GST Saathi targets.</w:t>
       </w:r>
     </w:p>
     <w:p>
       <w:pPr>
         <w:pStyle w:val="Heading2"/>
-        <w:spacing w:after="120" w:before="280"/>
-      </w:pPr>
-      <w:r>
-        <w:t xml:space="preserve">Commercialization path (long-term, beyond this course submission)</w:t>
+        <w:spacing w:before="280" w:after="120"/>
+      </w:pPr>
+      <w:r>
+        <w:t>Commercialization path (long-term, beyond this course submission)</w:t>
       </w:r>
     </w:p>
     <w:p>
@@ -570,25 +548,25 @@
         <w:spacing w:after="160"/>
       </w:pPr>
       <w:r>
-        <w:t xml:space="preserve">B2C/freemium to shopkeepers directly, with a plausible future B2B channel (CA firms offering it to their own clients as a transparency/trust feature). No real pilot users have been engaged yet — the next concrete step after this submission is finding 2–3 real shopkeepers or CAs to validate with.</w:t>
+        <w:t>B2C/freemium to shopkeepers directly, with a plausible future B2B channel (CA firms offering it to their own clients as a transparency/trust feature). No real pilot users have been engaged yet — the next concrete step after this submission is finding 2–3 real shopkeepers or CAs to validate with.</w:t>
       </w:r>
     </w:p>
     <w:p>
       <w:pPr>
         <w:pStyle w:val="Heading1"/>
-        <w:spacing w:after="160" w:before="360"/>
-      </w:pPr>
-      <w:r>
-        <w:t xml:space="preserve">4. Solution Overview</w:t>
+        <w:spacing w:before="360" w:after="160"/>
+      </w:pPr>
+      <w:r>
+        <w:t>4. Solution Overview</w:t>
       </w:r>
     </w:p>
     <w:p>
       <w:pPr>
         <w:pStyle w:val="Heading2"/>
-        <w:spacing w:after="120" w:before="280"/>
-      </w:pPr>
-      <w:r>
-        <w:t xml:space="preserve">v1 — Explainer (built, this submission)</w:t>
+        <w:spacing w:before="280" w:after="120"/>
+      </w:pPr>
+      <w:r>
+        <w:t>v1 — Explainer (built, this submission)</w:t>
       </w:r>
     </w:p>
     <w:p>
@@ -601,7 +579,7 @@
         <w:spacing w:after="80"/>
       </w:pPr>
       <w:r>
-        <w:t xml:space="preserve">User pastes GST filing / invoice / department-notice text, or selects one of three pre-loaded synthetic sample documents (a GSTR-3B monthly return, a B2B purchase invoice, and a department discrepancy notice).</w:t>
+        <w:t>User pastes GST filing / invoice / department-notice text, or selects one of three pre-loaded synthetic sample documents (a GSTR-3B monthly return, a B2B purchase invoice, and a department discrepancy notice).</w:t>
       </w:r>
     </w:p>
     <w:p>
@@ -614,7 +592,7 @@
         <w:spacing w:after="80"/>
       </w:pPr>
       <w:r>
-        <w:t xml:space="preserve">An LLM (Anthropic Claude, with an OpenAI fallback path already wired) returns a plain-language explanation: what the document is, what it means for the shopkeeper’s money, and what’s worth double-checking with their accountant.</w:t>
+        <w:t>An LLM (Anthropic Claude, with an OpenAI fallback path already wired) returns a plain-language explanation: what the document is, what it means for the shopkeeper’s money, and what’s worth double-checking with their accountant.</w:t>
       </w:r>
     </w:p>
     <w:p>
@@ -627,16 +605,16 @@
         <w:spacing w:after="80"/>
       </w:pPr>
       <w:r>
-        <w:t xml:space="preserve">The tool explains. It does not audit, verify, or certify the filing, and it never asserts that a filing or an accountant is right or wrong.</w:t>
+        <w:t>The tool explains. It does not audit, verify, or certify the filing, and it never asserts that a filing or an accountant is right or wrong.</w:t>
       </w:r>
     </w:p>
     <w:p>
       <w:pPr>
         <w:pStyle w:val="Heading2"/>
-        <w:spacing w:after="120" w:before="280"/>
-      </w:pPr>
-      <w:r>
-        <w:t xml:space="preserve">v2 — Auditor (future work, not built here)</w:t>
+        <w:spacing w:before="280" w:after="120"/>
+      </w:pPr>
+      <w:r>
+        <w:t>v2 — Auditor (future work, not built here)</w:t>
       </w:r>
     </w:p>
     <w:p>
@@ -649,7 +627,7 @@
         <w:spacing w:after="80"/>
       </w:pPr>
       <w:r>
-        <w:t xml:space="preserve">Cross-check a CA’s actual filing against the shopkeeper’s real invoices and sales records, and flag mismatches, missed ITC claims, or possible overbilling.</w:t>
+        <w:t>Cross-check a CA’s actual filing against the shopkeeper’s real invoices and sales records, and flag mismatches, missed ITC claims, or possible overbilling.</w:t>
       </w:r>
     </w:p>
     <w:p>
@@ -662,16 +640,16 @@
         <w:spacing w:after="80"/>
       </w:pPr>
       <w:r>
-        <w:t xml:space="preserve">Deliberately excluded from this submission (see Section 6).</w:t>
+        <w:t>Deliberately excluded from this submission (see Section 6).</w:t>
       </w:r>
     </w:p>
     <w:p>
       <w:pPr>
         <w:pStyle w:val="Heading1"/>
-        <w:spacing w:after="160" w:before="360"/>
-      </w:pPr>
-      <w:r>
-        <w:t xml:space="preserve">5. Technical Approach</w:t>
+        <w:spacing w:before="360" w:after="160"/>
+      </w:pPr>
+      <w:r>
+        <w:t>5. Technical Approach</w:t>
       </w:r>
     </w:p>
     <w:p>
@@ -684,7 +662,7 @@
         <w:spacing w:after="80"/>
       </w:pPr>
       <w:r>
-        <w:t xml:space="preserve">Stack: Next.js (App Router) + TypeScript + Tailwind CSS, deployed as a single web app with one API route.</w:t>
+        <w:t>Stack: Next.js (App Router) + TypeScript + Tailwind CSS, deployed as a single web app with one API route.</w:t>
       </w:r>
     </w:p>
     <w:p>
@@ -697,7 +675,7 @@
         <w:spacing w:after="80"/>
       </w:pPr>
       <w:r>
-        <w:t xml:space="preserve">AI layer: /api/explain route accepts the document text, an optional provider selection (Anthropic or OpenAI), and an optional user-supplied API key; it calls the corresponding LLM with a system prompt that constrains the model to explain only (explicitly instructed never to judge correctness or accuse anyone of error).</w:t>
+        <w:t>AI layer: /api/explain route accepts the document text, an optional provider selection (Anthropic or OpenAI), and an optional user-supplied API key; it calls the corresponding LLM with a system prompt that constrains the model to explain only (explicitly instructed never to judge correctness or accuse anyone of error).</w:t>
       </w:r>
     </w:p>
     <w:p>
@@ -710,7 +688,7 @@
         <w:spacing w:after="80"/>
       </w:pPr>
       <w:r>
-        <w:t xml:space="preserve">Frontend: a single page with a disclaimer banner, three pre-loaded sample documents, a free-text input, and a plain-language output panel. A provider/API-key toggle (Anthropic vs. OpenAI, optional personal key) was added as a second, independent feature.</w:t>
+        <w:t>Frontend: a single page with a disclaimer banner, three pre-loaded sample documents, a free-text input, and a plain-language output panel. A provider/API-key toggle (Anthropic vs. OpenAI, optional personal key) was added as a second, independent feature.</w:t>
       </w:r>
     </w:p>
     <w:p>
@@ -723,7 +701,8 @@
         <w:spacing w:after="80"/>
       </w:pPr>
       <w:r>
-        <w:t xml:space="preserve">Data handling: the prototype does not persist, log, or transmit uploaded documents beyond the active session. No real shopkeeper or CA data was used anywhere in building or testing this version — all sample documents are synthetic.</w:t>
+        <w:lastRenderedPageBreak/>
+        <w:t>Data handling: the prototype does not persist, log, or transmit uploaded documents beyond the active session. No real shopkeeper or CA data was used anywhere in building or testing this version — all sample documents are synthetic.</w:t>
       </w:r>
     </w:p>
     <w:p>
@@ -736,16 +715,16 @@
         <w:spacing w:after="80"/>
       </w:pPr>
       <w:r>
-        <w:t xml:space="preserve">Why this architecture: it needed to be demoable without any real third-party financial documents (none were available yet), which is why explainer-mode-on-synthetic-data was chosen as the buildable slice for this submission, with auditor mode (which requires real documents) deferred.</w:t>
+        <w:t>Why this architecture: it needed to be demoable without any real third-party financial documents (none were available yet), which is why explainer-mode-on-synthetic-data was chosen as the buildable slice for this submission, with auditor mode (which requires real documents) deferred.</w:t>
       </w:r>
     </w:p>
     <w:p>
       <w:pPr>
         <w:pStyle w:val="Heading1"/>
-        <w:spacing w:after="160" w:before="360"/>
-      </w:pPr>
-      <w:r>
-        <w:t xml:space="preserve">6. Scope Decisions and Why</w:t>
+        <w:spacing w:before="360" w:after="160"/>
+      </w:pPr>
+      <w:r>
+        <w:t>6. Scope Decisions and Why</w:t>
       </w:r>
     </w:p>
     <w:p>
@@ -753,7 +732,7 @@
         <w:spacing w:after="160"/>
       </w:pPr>
       <w:r>
-        <w:t xml:space="preserve">Two modes were considered from the start: Explainer and Auditor. Building both in the time available for this submission was deliberately rejected, for two reasons:</w:t>
+        <w:t>Two modes were considered from the start: Explainer and Auditor. Building both in the time available for this submission was deliberately rejected, for two reasons:</w:t>
       </w:r>
     </w:p>
     <w:p>
@@ -766,7 +745,7 @@
         <w:spacing w:after="80"/>
       </w:pPr>
       <w:r>
-        <w:t xml:space="preserve">Risk of an unfinished demo. Auditor mode requires real invoices and filings to be meaningful, which the team does not yet have access to (no CA or shopkeeper contacts have been established). Attempting it now would have produced a half-working feature instead of one solid one.</w:t>
+        <w:t>Risk of an unfinished demo. Auditor mode requires real invoices and filings to be meaningful, which the team does not yet have access to (no CA or shopkeeper contacts have been established). Attempting it now would have produced a half-working feature instead of one solid one.</w:t>
       </w:r>
     </w:p>
     <w:p>
@@ -779,24 +758,24 @@
         <w:spacing w:after="80"/>
       </w:pPr>
       <w:r>
-        <w:t xml:space="preserve">A distinct compliance question. Auditor mode would implicitly critique a licensed professional’s (the CA’s) filed work. Before that ships against real data, it needs: confidence-scored, “discrepancy not accusation” framing (to avoid defamation-adjacent claims about a real person’s professional work); compliance with India’s DPDP Act 2023 once real invoices/PII are involved; the CA’s own consent before their work product is processed; and stronger liability terms before any real financial decision could ride on the tool’s output. None of this blocks explainer mode on synthetic data, so it was tracked for later rather than treated as a blocker now.</w:t>
+        <w:t>A distinct compliance question. Auditor mode would implicitly critique a licensed professional’s (the CA’s) filed work. Before that ships against real data, it needs: confidence-scored, “discrepancy not accusation” framing (to avoid defamation-adjacent claims about a real person’s professional work); compliance with India’s DPDP Act 2023 once real invoices/PII are involved; the CA’s own consent before their work product is processed; and stronger liability terms before any real financial decision could ride on the tool’s output. None of this blocks explainer mode on synthetic data, so it was tracked for later rather than treated as a blocker now.</w:t>
       </w:r>
     </w:p>
     <w:p>
       <w:pPr>
         <w:pStyle w:val="Heading1"/>
-        <w:spacing w:after="160" w:before="360"/>
-      </w:pPr>
-      <w:r>
-        <w:t xml:space="preserve">7. Disclaimers and Limitations</w:t>
+        <w:spacing w:before="360" w:after="160"/>
+      </w:pPr>
+      <w:r>
+        <w:t>7. Disclaimers and Limitations</w:t>
       </w:r>
     </w:p>
     <w:p>
       <w:pPr>
         <w:pBdr>
-          <w:left w:val="single" w:color="999999" w:sz="12" w:space="8"/>
+          <w:left w:val="single" w:sz="12" w:space="8" w:color="999999"/>
         </w:pBdr>
-        <w:spacing w:after="160" w:before="80"/>
+        <w:spacing w:before="80" w:after="160"/>
         <w:ind w:left="360"/>
       </w:pPr>
       <w:r>
@@ -804,7 +783,7 @@
           <w:i/>
           <w:iCs/>
         </w:rPr>
-        <w:t xml:space="preserve">This prototype uses synthetic GST data for demonstration only. It is an AI explainer, not a compliance or audit tool, and does not replace a qualified Chartered Accountant.</w:t>
+        <w:t>This prototype uses synthetic GST data for demonstration only. It is an AI explainer, not a compliance or audit tool, and does not replace a qualified Chartered Accountant.</w:t>
       </w:r>
     </w:p>
     <w:p>
@@ -812,15 +791,15 @@
         <w:spacing w:after="160"/>
       </w:pPr>
       <w:r>
-        <w:t xml:space="preserve">Displayed in-app as:</w:t>
+        <w:t>Displayed in-app as:</w:t>
       </w:r>
     </w:p>
     <w:p>
       <w:pPr>
         <w:pBdr>
-          <w:left w:val="single" w:color="999999" w:sz="12" w:space="8"/>
+          <w:left w:val="single" w:sz="12" w:space="8" w:color="999999"/>
         </w:pBdr>
-        <w:spacing w:after="160" w:before="80"/>
+        <w:spacing w:before="80" w:after="160"/>
         <w:ind w:left="360"/>
       </w:pPr>
       <w:r>
@@ -828,7 +807,7 @@
           <w:i/>
           <w:iCs/>
         </w:rPr>
-        <w:t xml:space="preserve">“This is an educational tool using sample data. It explains filings in plain language — it is not tax, legal, or financial advice. Always verify with a registered tax professional before acting.”</w:t>
+        <w:t>“This is an educational tool using sample data. It explains filings in plain language — it is not tax, legal, or financial advice. Always verify with a registered tax professional before acting.”</w:t>
       </w:r>
     </w:p>
     <w:p>
@@ -836,16 +815,16 @@
         <w:spacing w:after="160"/>
       </w:pPr>
       <w:r>
-        <w:t xml:space="preserve">Known limitations: LLM output can be wrong or incomplete; the tool has not been tested against real filings; GST rules and rates change over time and the model’s knowledge may not reflect the latest changes.</w:t>
+        <w:t>Known limitations: LLM output can be wrong or incomplete; the tool has not been tested against real filings; GST rules and rates change over time and the model’s knowledge may not reflect the latest changes.</w:t>
       </w:r>
     </w:p>
     <w:p>
       <w:pPr>
         <w:pStyle w:val="Heading1"/>
-        <w:spacing w:after="160" w:before="360"/>
-      </w:pPr>
-      <w:r>
-        <w:t xml:space="preserve">8. Team Contributions</w:t>
+        <w:spacing w:before="360" w:after="160"/>
+      </w:pPr>
+      <w:r>
+        <w:t>8. Team Contributions</w:t>
       </w:r>
     </w:p>
     <w:p>
@@ -858,7 +837,7 @@
         <w:spacing w:after="80"/>
       </w:pPr>
       <w:r>
-        <w:t xml:space="preserve">Aksh Juneja: problem research, architecture, backend/API integration (LLM explainer route, prompt design), core UI, deployment, and this report.</w:t>
+        <w:t>Aksh Juneja: core UI, deployment, and this report.</w:t>
       </w:r>
     </w:p>
     <w:p>
@@ -871,7 +850,7 @@
         <w:spacing w:after="80"/>
       </w:pPr>
       <w:r>
-        <w:t xml:space="preserve">Shruti Agnihotri: provider/API-key toggle feature (frontend), allowing the explainer to run against either Anthropic or OpenAI with an optional user-supplied key.</w:t>
+        <w:t>Shruti Agnihotri: provider/API-key toggle feature (frontend), allowing the explainer to run against either Anthropic or OpenAI with an optional user-supplied key.</w:t>
       </w:r>
     </w:p>
     <w:p>
@@ -879,16 +858,16 @@
         <w:spacing w:after="160"/>
       </w:pPr>
       <w:r>
-        <w:t xml:space="preserve">Individual commits are visible in the GitHub history at the repository link above.</w:t>
+        <w:t>Individual commits are visible in the GitHub history at the repository link above.</w:t>
       </w:r>
     </w:p>
     <w:p>
       <w:pPr>
         <w:pStyle w:val="Heading1"/>
-        <w:spacing w:after="160" w:before="360"/>
-      </w:pPr>
-      <w:r>
-        <w:t xml:space="preserve">9. Future Work</w:t>
+        <w:spacing w:before="360" w:after="160"/>
+      </w:pPr>
+      <w:r>
+        <w:t>9. Future Work</w:t>
       </w:r>
     </w:p>
     <w:p>
@@ -901,7 +880,7 @@
         <w:spacing w:after="80"/>
       </w:pPr>
       <w:r>
-        <w:t xml:space="preserve">Validate the problem with 2–3 real shopkeepers/CAs (not yet done).</w:t>
+        <w:t>Validate the problem with 2–3 real shopkeepers/CAs (not yet done).</w:t>
       </w:r>
     </w:p>
     <w:p>
@@ -914,7 +893,7 @@
         <w:spacing w:after="80"/>
       </w:pPr>
       <w:r>
-        <w:t xml:space="preserve">Build Auditor mode once real documents and the compliance prerequisites in Section 6 are in place.</w:t>
+        <w:t>Build Auditor mode once real documents and the compliance prerequisites in Section 6 are in place.</w:t>
       </w:r>
     </w:p>
     <w:p>
@@ -927,7 +906,7 @@
         <w:spacing w:after="80"/>
       </w:pPr>
       <w:r>
-        <w:t xml:space="preserve">Expand language support (regional languages beyond English).</w:t>
+        <w:t>Expand language support (regional languages beyond English).</w:t>
       </w:r>
     </w:p>
     <w:p>
@@ -940,16 +919,17 @@
         <w:spacing w:after="80"/>
       </w:pPr>
       <w:r>
-        <w:t xml:space="preserve">Explore a B2B channel through CA firms as a client-transparency feature.</w:t>
+        <w:lastRenderedPageBreak/>
+        <w:t>Explore a B2B channel through CA firms as a client-transparency feature.</w:t>
       </w:r>
     </w:p>
     <w:p>
       <w:pPr>
         <w:pStyle w:val="Heading1"/>
-        <w:spacing w:after="160" w:before="360"/>
-      </w:pPr>
-      <w:r>
-        <w:t xml:space="preserve">10. How to Run</w:t>
+        <w:spacing w:before="360" w:after="160"/>
+      </w:pPr>
+      <w:r>
+        <w:t>10. How to Run</w:t>
       </w:r>
     </w:p>
     <w:p>
@@ -958,9 +938,9 @@
       </w:pPr>
       <w:r>
         <w:rPr>
-          <w:rFonts w:ascii="Consolas" w:cs="Consolas" w:eastAsia="Consolas" w:hAnsi="Consolas"/>
+          <w:rFonts w:ascii="Consolas" w:eastAsia="Consolas" w:hAnsi="Consolas" w:cs="Consolas"/>
         </w:rPr>
-        <w:t xml:space="preserve">git clone https://github.com/Aksh28/gst-saathi.git</w:t>
+        <w:t>git clone https://github.com/Aksh28/gst-saathi.git</w:t>
       </w:r>
     </w:p>
     <w:p>
@@ -969,9 +949,9 @@
       </w:pPr>
       <w:r>
         <w:rPr>
-          <w:rFonts w:ascii="Consolas" w:cs="Consolas" w:eastAsia="Consolas" w:hAnsi="Consolas"/>
+          <w:rFonts w:ascii="Consolas" w:eastAsia="Consolas" w:hAnsi="Consolas" w:cs="Consolas"/>
         </w:rPr>
-        <w:t xml:space="preserve">cd gst-saathi</w:t>
+        <w:t>cd gst-saathi</w:t>
       </w:r>
     </w:p>
     <w:p>
@@ -980,9 +960,9 @@
       </w:pPr>
       <w:r>
         <w:rPr>
-          <w:rFonts w:ascii="Consolas" w:cs="Consolas" w:eastAsia="Consolas" w:hAnsi="Consolas"/>
+          <w:rFonts w:ascii="Consolas" w:eastAsia="Consolas" w:hAnsi="Consolas" w:cs="Consolas"/>
         </w:rPr>
-        <w:t xml:space="preserve">npm install</w:t>
+        <w:t>npm install</w:t>
       </w:r>
     </w:p>
     <w:p>
@@ -991,9 +971,9 @@
       </w:pPr>
       <w:r>
         <w:rPr>
-          <w:rFonts w:ascii="Consolas" w:cs="Consolas" w:eastAsia="Consolas" w:hAnsi="Consolas"/>
+          <w:rFonts w:ascii="Consolas" w:eastAsia="Consolas" w:hAnsi="Consolas" w:cs="Consolas"/>
         </w:rPr>
-        <w:t xml:space="preserve"># create .env.local with: ANTHROPIC_API_KEY=your-key-here</w:t>
+        <w:t># create .env.local with: ANTHROPIC_API_KEY=your-key-here</w:t>
       </w:r>
     </w:p>
     <w:p>
@@ -1002,9 +982,9 @@
       </w:pPr>
       <w:r>
         <w:rPr>
-          <w:rFonts w:ascii="Consolas" w:cs="Consolas" w:eastAsia="Consolas" w:hAnsi="Consolas"/>
+          <w:rFonts w:ascii="Consolas" w:eastAsia="Consolas" w:hAnsi="Consolas" w:cs="Consolas"/>
         </w:rPr>
-        <w:t xml:space="preserve">npm run dev</w:t>
+        <w:t>npm run dev</w:t>
       </w:r>
     </w:p>
     <w:p>
@@ -1014,53 +994,54 @@
       <w:r>
         <w:t xml:space="preserve">Open </w:t>
       </w:r>
-      <w:hyperlink w:history="1" r:id="rIdc2-v9flz6n5blzzm7pdi5">
+      <w:hyperlink r:id="rId6" w:history="1">
         <w:r>
           <w:rPr>
             <w:rStyle w:val="Hyperlink"/>
           </w:rPr>
-          <w:t xml:space="preserve">http://localhost:3000</w:t>
+          <w:t>http://localhost:3000</w:t>
         </w:r>
       </w:hyperlink>
       <w:r>
-        <w:t xml:space="preserve">.</w:t>
+        <w:t>.</w:t>
       </w:r>
     </w:p>
     <w:p>
       <w:pPr>
         <w:pStyle w:val="Heading1"/>
-        <w:spacing w:after="160" w:before="360"/>
-      </w:pPr>
-      <w:r>
-        <w:t xml:space="preserve">11. Submission Checklist</w:t>
+        <w:spacing w:before="360" w:after="160"/>
+      </w:pPr>
+      <w:r>
+        <w:t>11. Submission Checklist</w:t>
       </w:r>
     </w:p>
     <w:tbl>
       <w:tblPr>
-        <w:tblW w:type="dxa" w:w="10080"/>
+        <w:tblW w:w="10080" w:type="dxa"/>
         <w:tblBorders>
-          <w:top w:val="single" w:color="auto" w:sz="4"/>
-          <w:left w:val="single" w:color="auto" w:sz="4"/>
-          <w:bottom w:val="single" w:color="auto" w:sz="4"/>
-          <w:right w:val="single" w:color="auto" w:sz="4"/>
-          <w:insideH w:val="single" w:color="auto" w:sz="4"/>
-          <w:insideV w:val="single" w:color="auto" w:sz="4"/>
+          <w:top w:val="single" w:sz="4" w:space="0" w:color="auto"/>
+          <w:left w:val="single" w:sz="4" w:space="0" w:color="auto"/>
+          <w:bottom w:val="single" w:sz="4" w:space="0" w:color="auto"/>
+          <w:right w:val="single" w:sz="4" w:space="0" w:color="auto"/>
+          <w:insideH w:val="single" w:sz="4" w:space="0" w:color="auto"/>
+          <w:insideV w:val="single" w:sz="4" w:space="0" w:color="auto"/>
         </w:tblBorders>
+        <w:tblLook w:val="04A0" w:firstRow="1" w:lastRow="0" w:firstColumn="1" w:lastColumn="0" w:noHBand="0" w:noVBand="1"/>
       </w:tblPr>
       <w:tblGrid>
-        <w:gridCol w:w="7000"/>
-        <w:gridCol w:w="2360"/>
+        <w:gridCol w:w="7538"/>
+        <w:gridCol w:w="2542"/>
       </w:tblGrid>
       <w:tr>
         <w:tc>
           <w:tcPr>
-            <w:tcW w:type="dxa" w:w="7000"/>
-            <w:shd w:fill="2F3B52" w:color="auto" w:val="clear"/>
-            <w:tcMar>
-              <w:top w:type="dxa" w:w="80"/>
-              <w:left w:type="dxa" w:w="100"/>
-              <w:bottom w:type="dxa" w:w="80"/>
-              <w:right w:type="dxa" w:w="100"/>
+            <w:tcW w:w="7000" w:type="dxa"/>
+            <w:shd w:val="clear" w:color="auto" w:fill="2F3B52"/>
+            <w:tcMar>
+              <w:top w:w="80" w:type="dxa"/>
+              <w:left w:w="100" w:type="dxa"/>
+              <w:bottom w:w="80" w:type="dxa"/>
+              <w:right w:w="100" w:type="dxa"/>
             </w:tcMar>
           </w:tcPr>
           <w:p>
@@ -1072,19 +1053,19 @@
                 <w:sz w:val="20"/>
                 <w:szCs w:val="20"/>
               </w:rPr>
-              <w:t xml:space="preserve">Item</w:t>
-            </w:r>
-          </w:p>
-        </w:tc>
-        <w:tc>
-          <w:tcPr>
-            <w:tcW w:type="dxa" w:w="2360"/>
-            <w:shd w:fill="2F3B52" w:color="auto" w:val="clear"/>
-            <w:tcMar>
-              <w:top w:type="dxa" w:w="80"/>
-              <w:left w:type="dxa" w:w="100"/>
-              <w:bottom w:type="dxa" w:w="80"/>
-              <w:right w:type="dxa" w:w="100"/>
+              <w:t>Item</w:t>
+            </w:r>
+          </w:p>
+        </w:tc>
+        <w:tc>
+          <w:tcPr>
+            <w:tcW w:w="2360" w:type="dxa"/>
+            <w:shd w:val="clear" w:color="auto" w:fill="2F3B52"/>
+            <w:tcMar>
+              <w:top w:w="80" w:type="dxa"/>
+              <w:left w:w="100" w:type="dxa"/>
+              <w:bottom w:w="80" w:type="dxa"/>
+              <w:right w:w="100" w:type="dxa"/>
             </w:tcMar>
           </w:tcPr>
           <w:p>
@@ -1096,7 +1077,7 @@
                 <w:sz w:val="20"/>
                 <w:szCs w:val="20"/>
               </w:rPr>
-              <w:t xml:space="preserve">Status</w:t>
+              <w:t>Status</w:t>
             </w:r>
           </w:p>
         </w:tc>
@@ -1104,47 +1085,43 @@
       <w:tr>
         <w:tc>
           <w:tcPr>
-            <w:tcW w:type="dxa" w:w="7000"/>
-            <w:tcMar>
-              <w:top w:type="dxa" w:w="80"/>
-              <w:left w:type="dxa" w:w="100"/>
-              <w:bottom w:type="dxa" w:w="80"/>
-              <w:right w:type="dxa" w:w="100"/>
-            </w:tcMar>
-          </w:tcPr>
-          <w:p>
-            <w:r>
-              <w:rPr>
-                <w:b w:val="false"/>
-                <w:bCs w:val="false"/>
+            <w:tcW w:w="7000" w:type="dxa"/>
+            <w:tcMar>
+              <w:top w:w="80" w:type="dxa"/>
+              <w:left w:w="100" w:type="dxa"/>
+              <w:bottom w:w="80" w:type="dxa"/>
+              <w:right w:w="100" w:type="dxa"/>
+            </w:tcMar>
+          </w:tcPr>
+          <w:p>
+            <w:r>
+              <w:rPr>
                 <w:color w:val="000000"/>
                 <w:sz w:val="20"/>
                 <w:szCs w:val="20"/>
               </w:rPr>
-              <w:t xml:space="preserve">GitHub repository (public)</w:t>
-            </w:r>
-          </w:p>
-        </w:tc>
-        <w:tc>
-          <w:tcPr>
-            <w:tcW w:type="dxa" w:w="2360"/>
-            <w:tcMar>
-              <w:top w:type="dxa" w:w="80"/>
-              <w:left w:type="dxa" w:w="100"/>
-              <w:bottom w:type="dxa" w:w="80"/>
-              <w:right w:type="dxa" w:w="100"/>
-            </w:tcMar>
-          </w:tcPr>
-          <w:p>
-            <w:r>
-              <w:rPr>
-                <w:b w:val="false"/>
-                <w:bCs w:val="false"/>
+              <w:t>GitHub repository (public)</w:t>
+            </w:r>
+          </w:p>
+        </w:tc>
+        <w:tc>
+          <w:tcPr>
+            <w:tcW w:w="2360" w:type="dxa"/>
+            <w:tcMar>
+              <w:top w:w="80" w:type="dxa"/>
+              <w:left w:w="100" w:type="dxa"/>
+              <w:bottom w:w="80" w:type="dxa"/>
+              <w:right w:w="100" w:type="dxa"/>
+            </w:tcMar>
+          </w:tcPr>
+          <w:p>
+            <w:r>
+              <w:rPr>
                 <w:color w:val="000000"/>
                 <w:sz w:val="20"/>
                 <w:szCs w:val="20"/>
               </w:rPr>
-              <w:t xml:space="preserve">Done</w:t>
+              <w:t>Done</w:t>
             </w:r>
           </w:p>
         </w:tc>
@@ -1152,47 +1129,43 @@
       <w:tr>
         <w:tc>
           <w:tcPr>
-            <w:tcW w:type="dxa" w:w="7000"/>
-            <w:tcMar>
-              <w:top w:type="dxa" w:w="80"/>
-              <w:left w:type="dxa" w:w="100"/>
-              <w:bottom w:type="dxa" w:w="80"/>
-              <w:right w:type="dxa" w:w="100"/>
-            </w:tcMar>
-          </w:tcPr>
-          <w:p>
-            <w:r>
-              <w:rPr>
-                <w:b w:val="false"/>
-                <w:bCs w:val="false"/>
+            <w:tcW w:w="7000" w:type="dxa"/>
+            <w:tcMar>
+              <w:top w:w="80" w:type="dxa"/>
+              <w:left w:w="100" w:type="dxa"/>
+              <w:bottom w:w="80" w:type="dxa"/>
+              <w:right w:w="100" w:type="dxa"/>
+            </w:tcMar>
+          </w:tcPr>
+          <w:p>
+            <w:r>
+              <w:rPr>
                 <w:color w:val="000000"/>
                 <w:sz w:val="20"/>
                 <w:szCs w:val="20"/>
               </w:rPr>
-              <w:t xml:space="preserve">Working prototype (v1 Explainer)</w:t>
-            </w:r>
-          </w:p>
-        </w:tc>
-        <w:tc>
-          <w:tcPr>
-            <w:tcW w:type="dxa" w:w="2360"/>
-            <w:tcMar>
-              <w:top w:type="dxa" w:w="80"/>
-              <w:left w:type="dxa" w:w="100"/>
-              <w:bottom w:type="dxa" w:w="80"/>
-              <w:right w:type="dxa" w:w="100"/>
-            </w:tcMar>
-          </w:tcPr>
-          <w:p>
-            <w:r>
-              <w:rPr>
-                <w:b w:val="false"/>
-                <w:bCs w:val="false"/>
+              <w:t>Working prototype (v1 Explainer)</w:t>
+            </w:r>
+          </w:p>
+        </w:tc>
+        <w:tc>
+          <w:tcPr>
+            <w:tcW w:w="2360" w:type="dxa"/>
+            <w:tcMar>
+              <w:top w:w="80" w:type="dxa"/>
+              <w:left w:w="100" w:type="dxa"/>
+              <w:bottom w:w="80" w:type="dxa"/>
+              <w:right w:w="100" w:type="dxa"/>
+            </w:tcMar>
+          </w:tcPr>
+          <w:p>
+            <w:r>
+              <w:rPr>
                 <w:color w:val="000000"/>
                 <w:sz w:val="20"/>
                 <w:szCs w:val="20"/>
               </w:rPr>
-              <w:t xml:space="preserve">Done</w:t>
+              <w:t>Done</w:t>
             </w:r>
           </w:p>
         </w:tc>
@@ -1200,47 +1173,43 @@
       <w:tr>
         <w:tc>
           <w:tcPr>
-            <w:tcW w:type="dxa" w:w="7000"/>
-            <w:tcMar>
-              <w:top w:type="dxa" w:w="80"/>
-              <w:left w:type="dxa" w:w="100"/>
-              <w:bottom w:type="dxa" w:w="80"/>
-              <w:right w:type="dxa" w:w="100"/>
-            </w:tcMar>
-          </w:tcPr>
-          <w:p>
-            <w:r>
-              <w:rPr>
-                <w:b w:val="false"/>
-                <w:bCs w:val="false"/>
+            <w:tcW w:w="7000" w:type="dxa"/>
+            <w:tcMar>
+              <w:top w:w="80" w:type="dxa"/>
+              <w:left w:w="100" w:type="dxa"/>
+              <w:bottom w:w="80" w:type="dxa"/>
+              <w:right w:w="100" w:type="dxa"/>
+            </w:tcMar>
+          </w:tcPr>
+          <w:p>
+            <w:r>
+              <w:rPr>
                 <w:color w:val="000000"/>
                 <w:sz w:val="20"/>
                 <w:szCs w:val="20"/>
               </w:rPr>
-              <w:t xml:space="preserve">README with setup instructions</w:t>
-            </w:r>
-          </w:p>
-        </w:tc>
-        <w:tc>
-          <w:tcPr>
-            <w:tcW w:type="dxa" w:w="2360"/>
-            <w:tcMar>
-              <w:top w:type="dxa" w:w="80"/>
-              <w:left w:type="dxa" w:w="100"/>
-              <w:bottom w:type="dxa" w:w="80"/>
-              <w:right w:type="dxa" w:w="100"/>
-            </w:tcMar>
-          </w:tcPr>
-          <w:p>
-            <w:r>
-              <w:rPr>
-                <w:b w:val="false"/>
-                <w:bCs w:val="false"/>
+              <w:t>README with setup instructions</w:t>
+            </w:r>
+          </w:p>
+        </w:tc>
+        <w:tc>
+          <w:tcPr>
+            <w:tcW w:w="2360" w:type="dxa"/>
+            <w:tcMar>
+              <w:top w:w="80" w:type="dxa"/>
+              <w:left w:w="100" w:type="dxa"/>
+              <w:bottom w:w="80" w:type="dxa"/>
+              <w:right w:w="100" w:type="dxa"/>
+            </w:tcMar>
+          </w:tcPr>
+          <w:p>
+            <w:r>
+              <w:rPr>
                 <w:color w:val="000000"/>
                 <w:sz w:val="20"/>
                 <w:szCs w:val="20"/>
               </w:rPr>
-              <w:t xml:space="preserve">Done</w:t>
+              <w:t>Done</w:t>
             </w:r>
           </w:p>
         </w:tc>
@@ -1248,47 +1217,43 @@
       <w:tr>
         <w:tc>
           <w:tcPr>
-            <w:tcW w:type="dxa" w:w="7000"/>
-            <w:tcMar>
-              <w:top w:type="dxa" w:w="80"/>
-              <w:left w:type="dxa" w:w="100"/>
-              <w:bottom w:type="dxa" w:w="80"/>
-              <w:right w:type="dxa" w:w="100"/>
-            </w:tcMar>
-          </w:tcPr>
-          <w:p>
-            <w:r>
-              <w:rPr>
-                <w:b w:val="false"/>
-                <w:bCs w:val="false"/>
+            <w:tcW w:w="7000" w:type="dxa"/>
+            <w:tcMar>
+              <w:top w:w="80" w:type="dxa"/>
+              <w:left w:w="100" w:type="dxa"/>
+              <w:bottom w:w="80" w:type="dxa"/>
+              <w:right w:w="100" w:type="dxa"/>
+            </w:tcMar>
+          </w:tcPr>
+          <w:p>
+            <w:r>
+              <w:rPr>
                 <w:color w:val="000000"/>
                 <w:sz w:val="20"/>
                 <w:szCs w:val="20"/>
               </w:rPr>
-              <w:t xml:space="preserve">This report</w:t>
-            </w:r>
-          </w:p>
-        </w:tc>
-        <w:tc>
-          <w:tcPr>
-            <w:tcW w:type="dxa" w:w="2360"/>
-            <w:tcMar>
-              <w:top w:type="dxa" w:w="80"/>
-              <w:left w:type="dxa" w:w="100"/>
-              <w:bottom w:type="dxa" w:w="80"/>
-              <w:right w:type="dxa" w:w="100"/>
-            </w:tcMar>
-          </w:tcPr>
-          <w:p>
-            <w:r>
-              <w:rPr>
-                <w:b w:val="false"/>
-                <w:bCs w:val="false"/>
+              <w:t>This report</w:t>
+            </w:r>
+          </w:p>
+        </w:tc>
+        <w:tc>
+          <w:tcPr>
+            <w:tcW w:w="2360" w:type="dxa"/>
+            <w:tcMar>
+              <w:top w:w="80" w:type="dxa"/>
+              <w:left w:w="100" w:type="dxa"/>
+              <w:bottom w:w="80" w:type="dxa"/>
+              <w:right w:w="100" w:type="dxa"/>
+            </w:tcMar>
+          </w:tcPr>
+          <w:p>
+            <w:r>
+              <w:rPr>
                 <w:color w:val="000000"/>
                 <w:sz w:val="20"/>
                 <w:szCs w:val="20"/>
               </w:rPr>
-              <w:t xml:space="preserve">Done</w:t>
+              <w:t>Done</w:t>
             </w:r>
           </w:p>
         </w:tc>
@@ -1296,47 +1261,43 @@
       <w:tr>
         <w:tc>
           <w:tcPr>
-            <w:tcW w:type="dxa" w:w="7000"/>
-            <w:tcMar>
-              <w:top w:type="dxa" w:w="80"/>
-              <w:left w:type="dxa" w:w="100"/>
-              <w:bottom w:type="dxa" w:w="80"/>
-              <w:right w:type="dxa" w:w="100"/>
-            </w:tcMar>
-          </w:tcPr>
-          <w:p>
-            <w:r>
-              <w:rPr>
-                <w:b w:val="false"/>
-                <w:bCs w:val="false"/>
+            <w:tcW w:w="7000" w:type="dxa"/>
+            <w:tcMar>
+              <w:top w:w="80" w:type="dxa"/>
+              <w:left w:w="100" w:type="dxa"/>
+              <w:bottom w:w="80" w:type="dxa"/>
+              <w:right w:w="100" w:type="dxa"/>
+            </w:tcMar>
+          </w:tcPr>
+          <w:p>
+            <w:r>
+              <w:rPr>
                 <w:color w:val="000000"/>
                 <w:sz w:val="20"/>
                 <w:szCs w:val="20"/>
               </w:rPr>
-              <w:t xml:space="preserve">Internal design/scope doc (docs/design-doc-v1.md)</w:t>
-            </w:r>
-          </w:p>
-        </w:tc>
-        <w:tc>
-          <w:tcPr>
-            <w:tcW w:type="dxa" w:w="2360"/>
-            <w:tcMar>
-              <w:top w:type="dxa" w:w="80"/>
-              <w:left w:type="dxa" w:w="100"/>
-              <w:bottom w:type="dxa" w:w="80"/>
-              <w:right w:type="dxa" w:w="100"/>
-            </w:tcMar>
-          </w:tcPr>
-          <w:p>
-            <w:r>
-              <w:rPr>
-                <w:b w:val="false"/>
-                <w:bCs w:val="false"/>
+              <w:t>Internal design/scope doc (docs/design-doc-v1.md)</w:t>
+            </w:r>
+          </w:p>
+        </w:tc>
+        <w:tc>
+          <w:tcPr>
+            <w:tcW w:w="2360" w:type="dxa"/>
+            <w:tcMar>
+              <w:top w:w="80" w:type="dxa"/>
+              <w:left w:w="100" w:type="dxa"/>
+              <w:bottom w:w="80" w:type="dxa"/>
+              <w:right w:w="100" w:type="dxa"/>
+            </w:tcMar>
+          </w:tcPr>
+          <w:p>
+            <w:r>
+              <w:rPr>
                 <w:color w:val="000000"/>
                 <w:sz w:val="20"/>
                 <w:szCs w:val="20"/>
               </w:rPr>
-              <w:t xml:space="preserve">Done</w:t>
+              <w:t>Done</w:t>
             </w:r>
           </w:p>
         </w:tc>
@@ -1344,47 +1305,43 @@
       <w:tr>
         <w:tc>
           <w:tcPr>
-            <w:tcW w:type="dxa" w:w="7000"/>
-            <w:tcMar>
-              <w:top w:type="dxa" w:w="80"/>
-              <w:left w:type="dxa" w:w="100"/>
-              <w:bottom w:type="dxa" w:w="80"/>
-              <w:right w:type="dxa" w:w="100"/>
-            </w:tcMar>
-          </w:tcPr>
-          <w:p>
-            <w:r>
-              <w:rPr>
-                <w:b w:val="false"/>
-                <w:bCs w:val="false"/>
+            <w:tcW w:w="7000" w:type="dxa"/>
+            <w:tcMar>
+              <w:top w:w="80" w:type="dxa"/>
+              <w:left w:w="100" w:type="dxa"/>
+              <w:bottom w:w="80" w:type="dxa"/>
+              <w:right w:w="100" w:type="dxa"/>
+            </w:tcMar>
+          </w:tcPr>
+          <w:p>
+            <w:r>
+              <w:rPr>
                 <w:color w:val="000000"/>
                 <w:sz w:val="20"/>
                 <w:szCs w:val="20"/>
               </w:rPr>
-              <w:t xml:space="preserve">Screenshots of the app in use</w:t>
-            </w:r>
-          </w:p>
-        </w:tc>
-        <w:tc>
-          <w:tcPr>
-            <w:tcW w:type="dxa" w:w="2360"/>
-            <w:tcMar>
-              <w:top w:type="dxa" w:w="80"/>
-              <w:left w:type="dxa" w:w="100"/>
-              <w:bottom w:type="dxa" w:w="80"/>
-              <w:right w:type="dxa" w:w="100"/>
-            </w:tcMar>
-          </w:tcPr>
-          <w:p>
-            <w:r>
-              <w:rPr>
-                <w:b w:val="false"/>
-                <w:bCs w:val="false"/>
+              <w:t>Screenshots of the app in use</w:t>
+            </w:r>
+          </w:p>
+        </w:tc>
+        <w:tc>
+          <w:tcPr>
+            <w:tcW w:w="2360" w:type="dxa"/>
+            <w:tcMar>
+              <w:top w:w="80" w:type="dxa"/>
+              <w:left w:w="100" w:type="dxa"/>
+              <w:bottom w:w="80" w:type="dxa"/>
+              <w:right w:w="100" w:type="dxa"/>
+            </w:tcMar>
+          </w:tcPr>
+          <w:p>
+            <w:r>
+              <w:rPr>
                 <w:color w:val="000000"/>
                 <w:sz w:val="20"/>
                 <w:szCs w:val="20"/>
               </w:rPr>
-              <w:t xml:space="preserve">Included in Section 12</w:t>
+              <w:t>Included in Section 12</w:t>
             </w:r>
           </w:p>
         </w:tc>
@@ -1398,10 +1355,10 @@
     <w:p>
       <w:pPr>
         <w:pStyle w:val="Heading1"/>
-        <w:spacing w:after="160" w:before="360"/>
-      </w:pPr>
-      <w:r>
-        <w:t xml:space="preserve">12. Screenshots — MVP in Action</w:t>
+        <w:spacing w:before="360" w:after="160"/>
+      </w:pPr>
+      <w:r>
+        <w:t>12. Screenshots — MVP in Action</w:t>
       </w:r>
     </w:p>
     <w:p>
@@ -1409,16 +1366,16 @@
         <w:spacing w:after="160"/>
       </w:pPr>
       <w:r>
-        <w:t xml:space="preserve">The screenshots below were captured directly from the running application (npm run dev) on 25 October 2026, demonstrating the core v1 Explainer flow end to end.</w:t>
+        <w:t>The screenshots below were captured directly from the running application (npm run dev) on 25 October 2026, demonstrating the core v1 Explainer flow end to end.</w:t>
       </w:r>
     </w:p>
     <w:p>
       <w:pPr>
         <w:pStyle w:val="Heading2"/>
-        <w:spacing w:after="120" w:before="280"/>
-      </w:pPr>
-      <w:r>
-        <w:t xml:space="preserve">12.1 Home screen</w:t>
+        <w:spacing w:before="280" w:after="120"/>
+      </w:pPr>
+      <w:r>
+        <w:t>12.1 Home screen</w:t>
       </w:r>
     </w:p>
     <w:p>
@@ -1426,20 +1383,24 @@
         <w:spacing w:after="160"/>
       </w:pPr>
       <w:r>
-        <w:t xml:space="preserve">The landing page shows the compliance disclaimer banner, the three pre-loaded synthetic sample documents, and the free-text input area.</w:t>
-      </w:r>
-    </w:p>
-    <w:p>
-      <w:pPr>
-        <w:spacing w:after="80" w:before="160"/>
+        <w:t>The landing page shows the compliance disclaimer banner, the three pre-loaded synthetic sample documents, and the free-text input area.</w:t>
+      </w:r>
+    </w:p>
+    <w:p>
+      <w:pPr>
+        <w:spacing w:before="160" w:after="80"/>
         <w:jc w:val="center"/>
       </w:pPr>
       <w:r>
+        <w:rPr>
+          <w:noProof/>
+        </w:rPr>
+        <w:lastRenderedPageBreak/>
         <w:drawing>
-          <wp:inline distT="0" distB="0" distL="0" distR="0">
+          <wp:inline distT="0" distB="0" distL="0" distR="0" wp14:anchorId="4B7858C3" wp14:editId="62F2026F">
             <wp:extent cx="5334000" cy="3752850"/>
-            <wp:effectExtent t="0" r="0" b="0" l="0"/>
-            <wp:docPr id="1" name=""/>
+            <wp:effectExtent l="0" t="0" r="0" b="0"/>
+            <wp:docPr id="1" name="Picture 1"/>
             <wp:cNvGraphicFramePr>
               <a:graphicFrameLocks xmlns:a="http://schemas.openxmlformats.org/drawingml/2006/main" noChangeAspect="1"/>
             </wp:cNvGraphicFramePr>
@@ -1447,13 +1408,13 @@
               <a:graphicData uri="http://schemas.openxmlformats.org/drawingml/2006/picture">
                 <pic:pic xmlns:pic="http://schemas.openxmlformats.org/drawingml/2006/picture">
                   <pic:nvPicPr>
-                    <pic:cNvPr id="0" name="" descr=""/>
+                    <pic:cNvPr id="0" name=""/>
                     <pic:cNvPicPr>
                       <a:picLocks noChangeAspect="1" noChangeArrowheads="1"/>
                     </pic:cNvPicPr>
                   </pic:nvPicPr>
                   <pic:blipFill>
-                    <a:blip r:embed="rId9" cstate="none"/>
+                    <a:blip r:embed="rId7"/>
                     <a:srcRect/>
                     <a:stretch>
                       <a:fillRect/>
@@ -1488,16 +1449,16 @@
           <w:sz w:val="18"/>
           <w:szCs w:val="18"/>
         </w:rPr>
-        <w:t xml:space="preserve">Figure 1: GST Saathi home screen with disclaimer banner and sample-document picker.</w:t>
+        <w:t>Figure 1: GST Saathi home screen with disclaimer banner and sample-document picker.</w:t>
       </w:r>
     </w:p>
     <w:p>
       <w:pPr>
         <w:pStyle w:val="Heading2"/>
-        <w:spacing w:after="120" w:before="280"/>
-      </w:pPr>
-      <w:r>
-        <w:t xml:space="preserve">12.2 Sample document loaded</w:t>
+        <w:spacing w:before="280" w:after="120"/>
+      </w:pPr>
+      <w:r>
+        <w:t>12.2 Sample document loaded</w:t>
       </w:r>
     </w:p>
     <w:p>
@@ -1505,20 +1466,23 @@
         <w:spacing w:after="160"/>
       </w:pPr>
       <w:r>
-        <w:t xml:space="preserve">Selecting a sample (here, the GSTR-3B monthly return) populates the input box with realistic synthetic filing text, ready to be explained.</w:t>
-      </w:r>
-    </w:p>
-    <w:p>
-      <w:pPr>
-        <w:spacing w:after="80" w:before="160"/>
+        <w:t>Selecting a sample (here, the GSTR-3B monthly return) populates the input box with realistic synthetic filing text, ready to be explained.</w:t>
+      </w:r>
+    </w:p>
+    <w:p>
+      <w:pPr>
+        <w:spacing w:before="160" w:after="80"/>
         <w:jc w:val="center"/>
       </w:pPr>
       <w:r>
+        <w:rPr>
+          <w:noProof/>
+        </w:rPr>
         <w:drawing>
-          <wp:inline distT="0" distB="0" distL="0" distR="0">
+          <wp:inline distT="0" distB="0" distL="0" distR="0" wp14:anchorId="7954551B" wp14:editId="3351E585">
             <wp:extent cx="5334000" cy="3752850"/>
-            <wp:effectExtent t="0" r="0" b="0" l="0"/>
-            <wp:docPr id="2" name=""/>
+            <wp:effectExtent l="0" t="0" r="0" b="0"/>
+            <wp:docPr id="2" name="Picture 2"/>
             <wp:cNvGraphicFramePr>
               <a:graphicFrameLocks xmlns:a="http://schemas.openxmlformats.org/drawingml/2006/main" noChangeAspect="1"/>
             </wp:cNvGraphicFramePr>
@@ -1526,13 +1490,13 @@
               <a:graphicData uri="http://schemas.openxmlformats.org/drawingml/2006/picture">
                 <pic:pic xmlns:pic="http://schemas.openxmlformats.org/drawingml/2006/picture">
                   <pic:nvPicPr>
-                    <pic:cNvPr id="0" name="" descr=""/>
+                    <pic:cNvPr id="0" name=""/>
                     <pic:cNvPicPr>
                       <a:picLocks noChangeAspect="1" noChangeArrowheads="1"/>
                     </pic:cNvPicPr>
                   </pic:nvPicPr>
                   <pic:blipFill>
-                    <a:blip r:embed="rId10" cstate="none"/>
+                    <a:blip r:embed="rId8"/>
                     <a:srcRect/>
                     <a:stretch>
                       <a:fillRect/>
@@ -1567,7 +1531,8 @@
           <w:sz w:val="18"/>
           <w:szCs w:val="18"/>
         </w:rPr>
-        <w:t xml:space="preserve">Figure 2: Synthetic GSTR-3B sample loaded into the explainer input.</w:t>
+        <w:lastRenderedPageBreak/>
+        <w:t>Figure 2: Synthetic GSTR-3B sample loaded into the explainer input.</w:t>
       </w:r>
     </w:p>
     <w:p>
@@ -1575,98 +1540,80 @@
         <w:spacing w:after="160"/>
       </w:pPr>
       <w:r>
-        <w:t xml:space="preserve">Note: generating the plain-language explanation itself requires an ANTHROPIC_API_KEY (or OPENAI_API_KEY) in .env.local, which is kept out of version control for security and was not configured on the machine used to capture these screenshots. The explain pipeline (prompt, provider call, error handling) is implemented and code-reviewed in app/api/explain/route.ts; running npm run dev with a key set reproduces the full flow, including the output panel shown in the UI.</w:t>
+        <w:t>Note: generating the plain-language explanation itself requires an ANTHROPIC_API_KEY (or OPENAI_API_KEY) in .env.local, which is kept out of version control for security and was not configured on the machine used to capture these screenshots. The explain pipeline (prompt, provider call, error handling) is implemented and code-reviewed in app/api/explain/route.ts; running npm run dev with a key set reproduces the full flow, including the output panel shown in the UI.</w:t>
       </w:r>
     </w:p>
     <w:sectPr>
-      <w:pgSz w:w="12240" w:h="15840" w:orient="portrait"/>
+      <w:pgSz w:w="12240" w:h="15840"/>
       <w:pgMar w:top="1080" w:right="1080" w:bottom="1080" w:left="1080" w:header="708" w:footer="708" w:gutter="0"/>
-      <w:pgNumType/>
+      <w:cols w:space="720"/>
       <w:docGrid w:linePitch="360"/>
     </w:sectPr>
   </w:body>
 </w:document>
 </file>
 
-<file path=word/endnotes.xml><?xml version="1.0" encoding="utf-8"?>
-<w:endnotes xmlns:wpc="http://schemas.microsoft.com/office/word/2010/wordprocessingCanvas" xmlns:mc="http://schemas.openxmlformats.org/markup-compatibility/2006" xmlns:o="urn:schemas-microsoft-com:office:office" xmlns:r="http://schemas.openxmlformats.org/officeDocument/2006/relationships" xmlns:m="http://schemas.openxmlformats.org/officeDocument/2006/math" xmlns:v="urn:schemas-microsoft-com:vml" xmlns:wp14="http://schemas.microsoft.com/office/word/2010/wordprocessingDrawing" xmlns:wp="http://schemas.openxmlformats.org/drawingml/2006/wordprocessingDrawing" xmlns:w10="urn:schemas-microsoft-com:office:word" xmlns:w="http://schemas.openxmlformats.org/wordprocessingml/2006/main" xmlns:w14="http://schemas.microsoft.com/office/word/2010/wordml" xmlns:w15="http://schemas.microsoft.com/office/word/2012/wordml" xmlns:wpg="http://schemas.microsoft.com/office/word/2010/wordprocessingGroup" xmlns:wpi="http://schemas.microsoft.com/office/word/2010/wordprocessingInk" xmlns:wne="http://schemas.microsoft.com/office/word/2006/wordml" xmlns:wps="http://schemas.microsoft.com/office/word/2010/wordprocessingShape" mc:Ignorable="w14 w15 wp14">
-  <w:endnote w:type="separator" w:id="-1">
-    <w:p>
-      <w:pPr>
-        <w:spacing w:after="0" w:line="240" w:lineRule="auto"/>
-      </w:pPr>
-      <w:r>
-        <w:rPr>
-          <w:rStyle w:val="EndnoteReference"/>
-        </w:rPr>
-        <w:endnoteRef/>
-      </w:r>
-      <w:r>
-        <w:separator/>
-      </w:r>
-    </w:p>
-  </w:endnote>
-  <w:endnote w:type="continuationSeparator" w:id="0">
-    <w:p>
-      <w:pPr>
-        <w:spacing w:after="0" w:line="240" w:lineRule="auto"/>
-      </w:pPr>
-      <w:r>
-        <w:rPr>
-          <w:rStyle w:val="EndnoteReference"/>
-        </w:rPr>
-        <w:endnoteRef/>
-      </w:r>
-      <w:r>
-        <w:continuationSeparator/>
-      </w:r>
-    </w:p>
-  </w:endnote>
-</w:endnotes>
-</file>
-
-<file path=word/footnotes.xml><?xml version="1.0" encoding="utf-8"?>
-<w:footnotes xmlns:wpc="http://schemas.microsoft.com/office/word/2010/wordprocessingCanvas" xmlns:mc="http://schemas.openxmlformats.org/markup-compatibility/2006" xmlns:o="urn:schemas-microsoft-com:office:office" xmlns:r="http://schemas.openxmlformats.org/officeDocument/2006/relationships" xmlns:m="http://schemas.openxmlformats.org/officeDocument/2006/math" xmlns:v="urn:schemas-microsoft-com:vml" xmlns:wp14="http://schemas.microsoft.com/office/word/2010/wordprocessingDrawing" xmlns:wp="http://schemas.openxmlformats.org/drawingml/2006/wordprocessingDrawing" xmlns:w10="urn:schemas-microsoft-com:office:word" xmlns:w="http://schemas.openxmlformats.org/wordprocessingml/2006/main" xmlns:w14="http://schemas.microsoft.com/office/word/2010/wordml" xmlns:w15="http://schemas.microsoft.com/office/word/2012/wordml" xmlns:wpg="http://schemas.microsoft.com/office/word/2010/wordprocessingGroup" xmlns:wpi="http://schemas.microsoft.com/office/word/2010/wordprocessingInk" xmlns:wne="http://schemas.microsoft.com/office/word/2006/wordml" xmlns:wps="http://schemas.microsoft.com/office/word/2010/wordprocessingShape" mc:Ignorable="w14 w15 wp14">
-  <w:footnote w:type="separator" w:id="-1">
-    <w:p>
-      <w:pPr>
-        <w:spacing w:after="0" w:line="240" w:lineRule="auto"/>
-      </w:pPr>
-      <w:r>
-        <w:rPr>
-          <w:rStyle w:val="FootnoteReference"/>
-        </w:rPr>
-        <w:footnoteRef/>
-      </w:r>
-      <w:r>
-        <w:separator/>
-      </w:r>
-    </w:p>
-  </w:footnote>
-  <w:footnote w:type="continuationSeparator" w:id="0">
-    <w:p>
-      <w:pPr>
-        <w:spacing w:after="0" w:line="240" w:lineRule="auto"/>
-      </w:pPr>
-      <w:r>
-        <w:rPr>
-          <w:rStyle w:val="FootnoteReference"/>
-        </w:rPr>
-        <w:footnoteRef/>
-      </w:r>
-      <w:r>
-        <w:continuationSeparator/>
-      </w:r>
-    </w:p>
-  </w:footnote>
-</w:footnotes>
-</file>
-
 <file path=word/numbering.xml><?xml version="1.0" encoding="utf-8"?>
-<w:numbering xmlns:wpc="http://schemas.microsoft.com/office/word/2010/wordprocessingCanvas" xmlns:mc="http://schemas.openxmlformats.org/markup-compatibility/2006" xmlns:o="urn:schemas-microsoft-com:office:office" xmlns:r="http://schemas.openxmlformats.org/officeDocument/2006/relationships" xmlns:m="http://schemas.openxmlformats.org/officeDocument/2006/math" xmlns:v="urn:schemas-microsoft-com:vml" xmlns:wp14="http://schemas.microsoft.com/office/word/2010/wordprocessingDrawing" xmlns:wp="http://schemas.openxmlformats.org/drawingml/2006/wordprocessingDrawing" xmlns:w10="urn:schemas-microsoft-com:office:word" xmlns:w="http://schemas.openxmlformats.org/wordprocessingml/2006/main" xmlns:w14="http://schemas.microsoft.com/office/word/2010/wordml" xmlns:w15="http://schemas.microsoft.com/office/word/2012/wordml" xmlns:wpg="http://schemas.microsoft.com/office/word/2010/wordprocessingGroup" xmlns:wpi="http://schemas.microsoft.com/office/word/2010/wordprocessingInk" xmlns:wne="http://schemas.microsoft.com/office/word/2006/wordml" xmlns:wps="http://schemas.microsoft.com/office/word/2010/wordprocessingShape" mc:Ignorable="w14 w15 wp14">
+<w:numbering xmlns:wpc="http://schemas.microsoft.com/office/word/2010/wordprocessingCanvas" xmlns:cx="http://schemas.microsoft.com/office/drawing/2014/chartex" xmlns:cx1="http://schemas.microsoft.com/office/drawing/2015/9/8/chartex" xmlns:cx2="http://schemas.microsoft.com/office/drawing/2015/10/21/chartex" xmlns:cx3="http://schemas.microsoft.com/office/drawing/2016/5/9/chartex" xmlns:cx4="http://schemas.microsoft.com/office/drawing/2016/5/10/chartex" xmlns:cx5="http://schemas.microsoft.com/office/drawing/2016/5/11/chartex" xmlns:cx6="http://schemas.microsoft.com/office/drawing/2016/5/12/chartex" xmlns:cx7="http://schemas.microsoft.com/office/drawing/2016/5/13/chartex" xmlns:cx8="http://schemas.microsoft.com/office/drawing/2016/5/14/chartex" xmlns:mc="http://schemas.openxmlformats.org/markup-compatibility/2006" xmlns:aink="http://schemas.microsoft.com/office/drawing/2016/ink" xmlns:am3d="http://schemas.microsoft.com/office/drawing/2017/model3d" xmlns:o="urn:schemas-microsoft-com:office:office" xmlns:oel="http://schemas.microsoft.com/office/2019/extlst" xmlns:r="http://schemas.openxmlformats.org/officeDocument/2006/relationships" xmlns:m="http://schemas.openxmlformats.org/officeDocument/2006/math" xmlns:v="urn:schemas-microsoft-com:vml" xmlns:wp14="http://schemas.microsoft.com/office/word/2010/wordprocessingDrawing" xmlns:wp="http://schemas.openxmlformats.org/drawingml/2006/wordprocessingDrawing" xmlns:w10="urn:schemas-microsoft-com:office:word" xmlns:w="http://schemas.openxmlformats.org/wordprocessingml/2006/main" xmlns:w14="http://schemas.microsoft.com/office/word/2010/wordml" xmlns:w15="http://schemas.microsoft.com/office/word/2012/wordml" xmlns:w16cex="http://schemas.microsoft.com/office/word/2018/wordml/cex" xmlns:w16cid="http://schemas.microsoft.com/office/word/2016/wordml/cid" xmlns:w16="http://schemas.microsoft.com/office/word/2018/wordml" xmlns:w16du="http://schemas.microsoft.com/office/word/2023/wordml/word16du" xmlns:w16sdtdh="http://schemas.microsoft.com/office/word/2020/wordml/sdtdatahash" xmlns:w16sdtfl="http://schemas.microsoft.com/office/word/2024/wordml/sdtformatlock" xmlns:w16se="http://schemas.microsoft.com/office/word/2015/wordml/symex" xmlns:wpg="http://schemas.microsoft.com/office/word/2010/wordprocessingGroup" xmlns:wpi="http://schemas.microsoft.com/office/word/2010/wordprocessingInk" xmlns:wne="http://schemas.microsoft.com/office/word/2006/wordml" xmlns:wps="http://schemas.microsoft.com/office/word/2010/wordprocessingShape" mc:Ignorable="w14 w15 w16se w16cid w16 w16cex w16sdtdh w16sdtfl w16du wp14">
+  <w:abstractNum w:abstractNumId="0" w15:restartNumberingAfterBreak="0">
+    <w:nsid w:val="00875C9A"/>
+    <w:multiLevelType w:val="hybridMultilevel"/>
+    <w:tmpl w:val="B8841C84"/>
+    <w:lvl w:ilvl="0" w:tplc="3CC25320">
+      <w:start w:val="1"/>
+      <w:numFmt w:val="bullet"/>
+      <w:lvlText w:val="•"/>
+      <w:lvlJc w:val="left"/>
+      <w:pPr>
+        <w:ind w:left="420" w:hanging="260"/>
+      </w:pPr>
+    </w:lvl>
+    <w:lvl w:ilvl="1" w:tplc="5C5A7F4C">
+      <w:numFmt w:val="decimal"/>
+      <w:lvlText w:val=""/>
+      <w:lvlJc w:val="left"/>
+    </w:lvl>
+    <w:lvl w:ilvl="2" w:tplc="2196E52A">
+      <w:numFmt w:val="decimal"/>
+      <w:lvlText w:val=""/>
+      <w:lvlJc w:val="left"/>
+    </w:lvl>
+    <w:lvl w:ilvl="3" w:tplc="16F2C274">
+      <w:numFmt w:val="decimal"/>
+      <w:lvlText w:val=""/>
+      <w:lvlJc w:val="left"/>
+    </w:lvl>
+    <w:lvl w:ilvl="4" w:tplc="853A8456">
+      <w:numFmt w:val="decimal"/>
+      <w:lvlText w:val=""/>
+      <w:lvlJc w:val="left"/>
+    </w:lvl>
+    <w:lvl w:ilvl="5" w:tplc="397CC48A">
+      <w:numFmt w:val="decimal"/>
+      <w:lvlText w:val=""/>
+      <w:lvlJc w:val="left"/>
+    </w:lvl>
+    <w:lvl w:ilvl="6" w:tplc="579677AE">
+      <w:numFmt w:val="decimal"/>
+      <w:lvlText w:val=""/>
+      <w:lvlJc w:val="left"/>
+    </w:lvl>
+    <w:lvl w:ilvl="7" w:tplc="C95A3F70">
+      <w:numFmt w:val="decimal"/>
+      <w:lvlText w:val=""/>
+      <w:lvlJc w:val="left"/>
+    </w:lvl>
+    <w:lvl w:ilvl="8" w:tplc="339067DC">
+      <w:numFmt w:val="decimal"/>
+      <w:lvlText w:val=""/>
+      <w:lvlJc w:val="left"/>
+    </w:lvl>
+  </w:abstractNum>
   <w:abstractNum w:abstractNumId="1" w15:restartNumberingAfterBreak="0">
+    <w:nsid w:val="57DF4190"/>
     <w:multiLevelType w:val="hybridMultilevel"/>
-    <w:lvl w:ilvl="0" w:tentative="1">
+    <w:tmpl w:val="E8140CD4"/>
+    <w:lvl w:ilvl="0" w:tplc="7A22D9D8" w:tentative="1">
       <w:start w:val="1"/>
       <w:numFmt w:val="bullet"/>
       <w:lvlText w:val="●"/>
@@ -1675,7 +1622,7 @@
         <w:ind w:left="720" w:hanging="360"/>
       </w:pPr>
     </w:lvl>
-    <w:lvl w:ilvl="1" w:tentative="1">
+    <w:lvl w:ilvl="1" w:tplc="AF70DED8" w:tentative="1">
       <w:start w:val="1"/>
       <w:numFmt w:val="bullet"/>
       <w:lvlText w:val="○"/>
@@ -1684,7 +1631,7 @@
         <w:ind w:left="1440" w:hanging="360"/>
       </w:pPr>
     </w:lvl>
-    <w:lvl w:ilvl="2" w:tentative="1">
+    <w:lvl w:ilvl="2" w:tplc="B1C0A424" w:tentative="1">
       <w:start w:val="1"/>
       <w:numFmt w:val="bullet"/>
       <w:lvlText w:val="■"/>
@@ -1693,7 +1640,7 @@
         <w:ind w:left="2160" w:hanging="360"/>
       </w:pPr>
     </w:lvl>
-    <w:lvl w:ilvl="3" w:tentative="1">
+    <w:lvl w:ilvl="3" w:tplc="725A8416" w:tentative="1">
       <w:start w:val="1"/>
       <w:numFmt w:val="bullet"/>
       <w:lvlText w:val="●"/>
@@ -1702,7 +1649,7 @@
         <w:ind w:left="2880" w:hanging="360"/>
       </w:pPr>
     </w:lvl>
-    <w:lvl w:ilvl="4" w:tentative="1">
+    <w:lvl w:ilvl="4" w:tplc="DA520FCC" w:tentative="1">
       <w:start w:val="1"/>
       <w:numFmt w:val="bullet"/>
       <w:lvlText w:val="○"/>
@@ -1711,7 +1658,7 @@
         <w:ind w:left="3600" w:hanging="360"/>
       </w:pPr>
     </w:lvl>
-    <w:lvl w:ilvl="5" w:tentative="1">
+    <w:lvl w:ilvl="5" w:tplc="67D02496" w:tentative="1">
       <w:start w:val="1"/>
       <w:numFmt w:val="bullet"/>
       <w:lvlText w:val="■"/>
@@ -1720,7 +1667,7 @@
         <w:ind w:left="4320" w:hanging="360"/>
       </w:pPr>
     </w:lvl>
-    <w:lvl w:ilvl="6" w:tentative="1">
+    <w:lvl w:ilvl="6" w:tplc="E5662EA0" w:tentative="1">
       <w:start w:val="1"/>
       <w:numFmt w:val="bullet"/>
       <w:lvlText w:val="●"/>
@@ -1729,7 +1676,7 @@
         <w:ind w:left="5040" w:hanging="360"/>
       </w:pPr>
     </w:lvl>
-    <w:lvl w:ilvl="7" w:tentative="1">
+    <w:lvl w:ilvl="7" w:tplc="117619E0" w:tentative="1">
       <w:start w:val="1"/>
       <w:numFmt w:val="bullet"/>
       <w:lvlText w:val="●"/>
@@ -1738,7 +1685,7 @@
         <w:ind w:left="5760" w:hanging="360"/>
       </w:pPr>
     </w:lvl>
-    <w:lvl w:ilvl="8" w:tentative="1">
+    <w:lvl w:ilvl="8" w:tplc="1814FBEC" w:tentative="1">
       <w:start w:val="1"/>
       <w:numFmt w:val="bullet"/>
       <w:lvlText w:val="●"/>
@@ -1748,26 +1695,14 @@
       </w:pPr>
     </w:lvl>
   </w:abstractNum>
-  <w:abstractNum w:abstractNumId="2" w15:restartNumberingAfterBreak="0">
-    <w:multiLevelType w:val="hybridMultilevel"/>
-    <w:lvl w:ilvl="0" w:tentative="1">
-      <w:start w:val="1"/>
-      <w:numFmt w:val="bullet"/>
-      <w:lvlText w:val="•"/>
-      <w:lvlJc w:val="left"/>
-      <w:pPr>
-        <w:ind w:left="420" w:hanging="260"/>
-      </w:pPr>
-    </w:lvl>
-  </w:abstractNum>
-  <w:num w:numId="1">
+  <w:num w:numId="1" w16cid:durableId="1172717944">
     <w:abstractNumId w:val="1"/>
     <w:lvlOverride w:ilvl="0">
       <w:startOverride w:val="1"/>
     </w:lvlOverride>
   </w:num>
-  <w:num w:numId="2">
-    <w:abstractNumId w:val="2"/>
+  <w:num w:numId="2" w16cid:durableId="25953805">
+    <w:abstractNumId w:val="0"/>
     <w:lvlOverride w:ilvl="0">
       <w:startOverride w:val="1"/>
     </w:lvlOverride>
@@ -1776,110 +1711,535 @@
 </file>
 
 <file path=word/styles.xml><?xml version="1.0" encoding="utf-8"?>
-<w:styles xmlns:mc="http://schemas.openxmlformats.org/markup-compatibility/2006" xmlns:r="http://schemas.openxmlformats.org/officeDocument/2006/relationships" xmlns:w="http://schemas.openxmlformats.org/wordprocessingml/2006/main" xmlns:w14="http://schemas.microsoft.com/office/word/2010/wordml" xmlns:w15="http://schemas.microsoft.com/office/word/2012/wordml" mc:Ignorable="w14 w15">
+<w:styles xmlns:mc="http://schemas.openxmlformats.org/markup-compatibility/2006" xmlns:r="http://schemas.openxmlformats.org/officeDocument/2006/relationships" xmlns:w="http://schemas.openxmlformats.org/wordprocessingml/2006/main" xmlns:w14="http://schemas.microsoft.com/office/word/2010/wordml" xmlns:w15="http://schemas.microsoft.com/office/word/2012/wordml" xmlns:w16cex="http://schemas.microsoft.com/office/word/2018/wordml/cex" xmlns:w16cid="http://schemas.microsoft.com/office/word/2016/wordml/cid" xmlns:w16="http://schemas.microsoft.com/office/word/2018/wordml" xmlns:w16du="http://schemas.microsoft.com/office/word/2023/wordml/word16du" xmlns:w16sdtdh="http://schemas.microsoft.com/office/word/2020/wordml/sdtdatahash" xmlns:w16sdtfl="http://schemas.microsoft.com/office/word/2024/wordml/sdtformatlock" xmlns:w16se="http://schemas.microsoft.com/office/word/2015/wordml/symex" mc:Ignorable="w14 w15 w16se w16cid w16 w16cex w16sdtdh w16sdtfl w16du">
   <w:docDefaults>
     <w:rPrDefault>
       <w:rPr>
-        <w:rFonts w:ascii="Calibri" w:cs="Calibri" w:eastAsia="Calibri" w:hAnsi="Calibri"/>
+        <w:rFonts w:ascii="Calibri" w:eastAsia="Calibri" w:hAnsi="Calibri" w:cs="Calibri"/>
         <w:sz w:val="22"/>
         <w:szCs w:val="22"/>
+        <w:lang w:val="en-IN" w:eastAsia="en-IN" w:bidi="ar-SA"/>
       </w:rPr>
     </w:rPrDefault>
     <w:pPrDefault/>
   </w:docDefaults>
-  <w:style w:type="paragraph" w:styleId="Normal" w:default="1">
+  <w:latentStyles w:defLockedState="0" w:defUIPriority="99" w:defSemiHidden="0" w:defUnhideWhenUsed="0" w:defQFormat="0" w:count="376">
+    <w:lsdException w:name="Normal" w:uiPriority="0" w:qFormat="1"/>
+    <w:lsdException w:name="heading 1" w:uiPriority="9" w:qFormat="1"/>
+    <w:lsdException w:name="heading 2" w:semiHidden="1" w:uiPriority="9" w:unhideWhenUsed="1" w:qFormat="1"/>
+    <w:lsdException w:name="heading 3" w:semiHidden="1" w:uiPriority="9" w:unhideWhenUsed="1" w:qFormat="1"/>
+    <w:lsdException w:name="heading 4" w:semiHidden="1" w:uiPriority="9" w:unhideWhenUsed="1" w:qFormat="1"/>
+    <w:lsdException w:name="heading 5" w:semiHidden="1" w:uiPriority="9" w:unhideWhenUsed="1" w:qFormat="1"/>
+    <w:lsdException w:name="heading 6" w:semiHidden="1" w:uiPriority="9" w:unhideWhenUsed="1" w:qFormat="1"/>
+    <w:lsdException w:name="heading 7" w:semiHidden="1" w:uiPriority="9" w:unhideWhenUsed="1" w:qFormat="1"/>
+    <w:lsdException w:name="heading 8" w:semiHidden="1" w:uiPriority="9" w:unhideWhenUsed="1" w:qFormat="1"/>
+    <w:lsdException w:name="heading 9" w:semiHidden="1" w:uiPriority="9" w:unhideWhenUsed="1" w:qFormat="1"/>
+    <w:lsdException w:name="index 1" w:semiHidden="1" w:unhideWhenUsed="1"/>
+    <w:lsdException w:name="index 2" w:semiHidden="1" w:unhideWhenUsed="1"/>
+    <w:lsdException w:name="index 3" w:semiHidden="1" w:unhideWhenUsed="1"/>
+    <w:lsdException w:name="index 4" w:semiHidden="1" w:unhideWhenUsed="1"/>
+    <w:lsdException w:name="index 5" w:semiHidden="1" w:unhideWhenUsed="1"/>
+    <w:lsdException w:name="index 6" w:semiHidden="1" w:unhideWhenUsed="1"/>
+    <w:lsdException w:name="index 7" w:semiHidden="1" w:unhideWhenUsed="1"/>
+    <w:lsdException w:name="index 8" w:semiHidden="1" w:unhideWhenUsed="1"/>
+    <w:lsdException w:name="index 9" w:semiHidden="1" w:unhideWhenUsed="1"/>
+    <w:lsdException w:name="toc 1" w:semiHidden="1" w:uiPriority="39" w:unhideWhenUsed="1"/>
+    <w:lsdException w:name="toc 2" w:semiHidden="1" w:uiPriority="39" w:unhideWhenUsed="1"/>
+    <w:lsdException w:name="toc 3" w:semiHidden="1" w:uiPriority="39" w:unhideWhenUsed="1"/>
+    <w:lsdException w:name="toc 4" w:semiHidden="1" w:uiPriority="39" w:unhideWhenUsed="1"/>
+    <w:lsdException w:name="toc 5" w:semiHidden="1" w:uiPriority="39" w:unhideWhenUsed="1"/>
+    <w:lsdException w:name="toc 6" w:semiHidden="1" w:uiPriority="39" w:unhideWhenUsed="1"/>
+    <w:lsdException w:name="toc 7" w:semiHidden="1" w:uiPriority="39" w:unhideWhenUsed="1"/>
+    <w:lsdException w:name="toc 8" w:semiHidden="1" w:uiPriority="39" w:unhideWhenUsed="1"/>
+    <w:lsdException w:name="toc 9" w:semiHidden="1" w:uiPriority="39" w:unhideWhenUsed="1"/>
+    <w:lsdException w:name="Normal Indent" w:semiHidden="1" w:unhideWhenUsed="1"/>
+    <w:lsdException w:name="footnote text" w:semiHidden="1" w:unhideWhenUsed="1"/>
+    <w:lsdException w:name="annotation text" w:semiHidden="1" w:unhideWhenUsed="1"/>
+    <w:lsdException w:name="header" w:semiHidden="1" w:unhideWhenUsed="1"/>
+    <w:lsdException w:name="footer" w:semiHidden="1" w:unhideWhenUsed="1"/>
+    <w:lsdException w:name="index heading" w:semiHidden="1" w:unhideWhenUsed="1"/>
+    <w:lsdException w:name="caption" w:semiHidden="1" w:uiPriority="35" w:unhideWhenUsed="1" w:qFormat="1"/>
+    <w:lsdException w:name="table of figures" w:semiHidden="1" w:unhideWhenUsed="1"/>
+    <w:lsdException w:name="envelope address" w:semiHidden="1" w:unhideWhenUsed="1"/>
+    <w:lsdException w:name="envelope return" w:semiHidden="1" w:unhideWhenUsed="1"/>
+    <w:lsdException w:name="footnote reference" w:semiHidden="1" w:unhideWhenUsed="1"/>
+    <w:lsdException w:name="annotation reference" w:semiHidden="1" w:unhideWhenUsed="1"/>
+    <w:lsdException w:name="line number" w:semiHidden="1" w:unhideWhenUsed="1"/>
+    <w:lsdException w:name="page number" w:semiHidden="1" w:unhideWhenUsed="1"/>
+    <w:lsdException w:name="endnote reference" w:semiHidden="1" w:unhideWhenUsed="1"/>
+    <w:lsdException w:name="endnote text" w:semiHidden="1" w:unhideWhenUsed="1"/>
+    <w:lsdException w:name="table of authorities" w:semiHidden="1" w:unhideWhenUsed="1"/>
+    <w:lsdException w:name="macro" w:semiHidden="1" w:unhideWhenUsed="1"/>
+    <w:lsdException w:name="toa heading" w:semiHidden="1" w:unhideWhenUsed="1"/>
+    <w:lsdException w:name="List" w:semiHidden="1" w:unhideWhenUsed="1"/>
+    <w:lsdException w:name="List Bullet" w:semiHidden="1" w:unhideWhenUsed="1"/>
+    <w:lsdException w:name="List Number" w:semiHidden="1" w:unhideWhenUsed="1"/>
+    <w:lsdException w:name="List 2" w:semiHidden="1" w:unhideWhenUsed="1"/>
+    <w:lsdException w:name="List 3" w:semiHidden="1" w:unhideWhenUsed="1"/>
+    <w:lsdException w:name="List 4" w:semiHidden="1" w:unhideWhenUsed="1"/>
+    <w:lsdException w:name="List 5" w:semiHidden="1" w:unhideWhenUsed="1"/>
+    <w:lsdException w:name="List Bullet 2" w:semiHidden="1" w:unhideWhenUsed="1"/>
+    <w:lsdException w:name="List Bullet 3" w:semiHidden="1" w:unhideWhenUsed="1"/>
+    <w:lsdException w:name="List Bullet 4" w:semiHidden="1" w:unhideWhenUsed="1"/>
+    <w:lsdException w:name="List Bullet 5" w:semiHidden="1" w:unhideWhenUsed="1"/>
+    <w:lsdException w:name="List Number 2" w:semiHidden="1" w:unhideWhenUsed="1"/>
+    <w:lsdException w:name="List Number 3" w:semiHidden="1" w:unhideWhenUsed="1"/>
+    <w:lsdException w:name="List Number 4" w:semiHidden="1" w:unhideWhenUsed="1"/>
+    <w:lsdException w:name="List Number 5" w:semiHidden="1" w:unhideWhenUsed="1"/>
+    <w:lsdException w:name="Title" w:uiPriority="10" w:qFormat="1"/>
+    <w:lsdException w:name="Closing" w:semiHidden="1" w:unhideWhenUsed="1"/>
+    <w:lsdException w:name="Signature" w:semiHidden="1" w:unhideWhenUsed="1"/>
+    <w:lsdException w:name="Default Paragraph Font" w:semiHidden="1" w:uiPriority="1" w:unhideWhenUsed="1"/>
+    <w:lsdException w:name="Body Text" w:semiHidden="1" w:unhideWhenUsed="1"/>
+    <w:lsdException w:name="Body Text Indent" w:semiHidden="1" w:unhideWhenUsed="1"/>
+    <w:lsdException w:name="List Continue" w:semiHidden="1" w:unhideWhenUsed="1"/>
+    <w:lsdException w:name="List Continue 2" w:semiHidden="1" w:unhideWhenUsed="1"/>
+    <w:lsdException w:name="List Continue 3" w:semiHidden="1" w:unhideWhenUsed="1"/>
+    <w:lsdException w:name="List Continue 4" w:semiHidden="1" w:unhideWhenUsed="1"/>
+    <w:lsdException w:name="List Continue 5" w:semiHidden="1" w:unhideWhenUsed="1"/>
+    <w:lsdException w:name="Message Header" w:semiHidden="1" w:unhideWhenUsed="1"/>
+    <w:lsdException w:name="Subtitle" w:uiPriority="11" w:qFormat="1"/>
+    <w:lsdException w:name="Salutation" w:semiHidden="1" w:unhideWhenUsed="1"/>
+    <w:lsdException w:name="Date" w:semiHidden="1" w:unhideWhenUsed="1"/>
+    <w:lsdException w:name="Body Text First Indent" w:semiHidden="1" w:unhideWhenUsed="1"/>
+    <w:lsdException w:name="Body Text First Indent 2" w:semiHidden="1" w:unhideWhenUsed="1"/>
+    <w:lsdException w:name="Note Heading" w:semiHidden="1" w:unhideWhenUsed="1"/>
+    <w:lsdException w:name="Body Text 2" w:semiHidden="1" w:unhideWhenUsed="1"/>
+    <w:lsdException w:name="Body Text 3" w:semiHidden="1" w:unhideWhenUsed="1"/>
+    <w:lsdException w:name="Body Text Indent 2" w:semiHidden="1" w:unhideWhenUsed="1"/>
+    <w:lsdException w:name="Body Text Indent 3" w:semiHidden="1" w:unhideWhenUsed="1"/>
+    <w:lsdException w:name="Block Text" w:semiHidden="1" w:unhideWhenUsed="1"/>
+    <w:lsdException w:name="Hyperlink" w:semiHidden="1" w:unhideWhenUsed="1"/>
+    <w:lsdException w:name="FollowedHyperlink" w:semiHidden="1" w:unhideWhenUsed="1"/>
+    <w:lsdException w:name="Strong" w:uiPriority="22" w:qFormat="1"/>
+    <w:lsdException w:name="Emphasis" w:uiPriority="20" w:qFormat="1"/>
+    <w:lsdException w:name="Document Map" w:semiHidden="1" w:unhideWhenUsed="1"/>
+    <w:lsdException w:name="Plain Text" w:semiHidden="1" w:unhideWhenUsed="1"/>
+    <w:lsdException w:name="E-mail Signature" w:semiHidden="1" w:unhideWhenUsed="1"/>
+    <w:lsdException w:name="HTML Top of Form" w:semiHidden="1" w:unhideWhenUsed="1"/>
+    <w:lsdException w:name="HTML Bottom of Form" w:semiHidden="1" w:unhideWhenUsed="1"/>
+    <w:lsdException w:name="Normal (Web)" w:semiHidden="1" w:unhideWhenUsed="1"/>
+    <w:lsdException w:name="HTML Acronym" w:semiHidden="1" w:unhideWhenUsed="1"/>
+    <w:lsdException w:name="HTML Address" w:semiHidden="1" w:unhideWhenUsed="1"/>
+    <w:lsdException w:name="HTML Cite" w:semiHidden="1" w:unhideWhenUsed="1"/>
+    <w:lsdException w:name="HTML Code" w:semiHidden="1" w:unhideWhenUsed="1"/>
+    <w:lsdException w:name="HTML Definition" w:semiHidden="1" w:unhideWhenUsed="1"/>
+    <w:lsdException w:name="HTML Keyboard" w:semiHidden="1" w:unhideWhenUsed="1"/>
+    <w:lsdException w:name="HTML Preformatted" w:semiHidden="1" w:unhideWhenUsed="1"/>
+    <w:lsdException w:name="HTML Sample" w:semiHidden="1" w:unhideWhenUsed="1"/>
+    <w:lsdException w:name="HTML Typewriter" w:semiHidden="1" w:unhideWhenUsed="1"/>
+    <w:lsdException w:name="HTML Variable" w:semiHidden="1" w:unhideWhenUsed="1"/>
+    <w:lsdException w:name="Normal Table" w:semiHidden="1" w:unhideWhenUsed="1"/>
+    <w:lsdException w:name="annotation subject" w:semiHidden="1" w:unhideWhenUsed="1"/>
+    <w:lsdException w:name="No List" w:semiHidden="1" w:unhideWhenUsed="1"/>
+    <w:lsdException w:name="Outline List 1" w:semiHidden="1" w:unhideWhenUsed="1"/>
+    <w:lsdException w:name="Outline List 2" w:semiHidden="1" w:unhideWhenUsed="1"/>
+    <w:lsdException w:name="Outline List 3" w:semiHidden="1" w:unhideWhenUsed="1"/>
+    <w:lsdException w:name="Table Simple 1" w:semiHidden="1" w:unhideWhenUsed="1"/>
+    <w:lsdException w:name="Table Simple 2" w:semiHidden="1" w:unhideWhenUsed="1"/>
+    <w:lsdException w:name="Table Simple 3" w:semiHidden="1" w:unhideWhenUsed="1"/>
+    <w:lsdException w:name="Table Classic 1" w:semiHidden="1" w:unhideWhenUsed="1"/>
+    <w:lsdException w:name="Table Classic 2" w:semiHidden="1" w:unhideWhenUsed="1"/>
+    <w:lsdException w:name="Table Classic 3" w:semiHidden="1" w:unhideWhenUsed="1"/>
+    <w:lsdException w:name="Table Classic 4" w:semiHidden="1" w:unhideWhenUsed="1"/>
+    <w:lsdException w:name="Table Colorful 1" w:semiHidden="1" w:unhideWhenUsed="1"/>
+    <w:lsdException w:name="Table Colorful 2" w:semiHidden="1" w:unhideWhenUsed="1"/>
+    <w:lsdException w:name="Table Colorful 3" w:semiHidden="1" w:unhideWhenUsed="1"/>
+    <w:lsdException w:name="Table Columns 1" w:semiHidden="1" w:unhideWhenUsed="1"/>
+    <w:lsdException w:name="Table Columns 2" w:semiHidden="1" w:unhideWhenUsed="1"/>
+    <w:lsdException w:name="Table Columns 3" w:semiHidden="1" w:unhideWhenUsed="1"/>
+    <w:lsdException w:name="Table Columns 4" w:semiHidden="1" w:unhideWhenUsed="1"/>
+    <w:lsdException w:name="Table Columns 5" w:semiHidden="1" w:unhideWhenUsed="1"/>
+    <w:lsdException w:name="Table Grid 1" w:semiHidden="1" w:unhideWhenUsed="1"/>
+    <w:lsdException w:name="Table Grid 2" w:semiHidden="1" w:unhideWhenUsed="1"/>
+    <w:lsdException w:name="Table Grid 3" w:semiHidden="1" w:unhideWhenUsed="1"/>
+    <w:lsdException w:name="Table Grid 4" w:semiHidden="1" w:unhideWhenUsed="1"/>
+    <w:lsdException w:name="Table Grid 5" w:semiHidden="1" w:unhideWhenUsed="1"/>
+    <w:lsdException w:name="Table Grid 6" w:semiHidden="1" w:unhideWhenUsed="1"/>
+    <w:lsdException w:name="Table Grid 7" w:semiHidden="1" w:unhideWhenUsed="1"/>
+    <w:lsdException w:name="Table Grid 8" w:semiHidden="1" w:unhideWhenUsed="1"/>
+    <w:lsdException w:name="Table List 1" w:semiHidden="1" w:unhideWhenUsed="1"/>
+    <w:lsdException w:name="Table List 2" w:semiHidden="1" w:unhideWhenUsed="1"/>
+    <w:lsdException w:name="Table List 3" w:semiHidden="1" w:unhideWhenUsed="1"/>
+    <w:lsdException w:name="Table List 4" w:semiHidden="1" w:unhideWhenUsed="1"/>
+    <w:lsdException w:name="Table List 5" w:semiHidden="1" w:unhideWhenUsed="1"/>
+    <w:lsdException w:name="Table List 6" w:semiHidden="1" w:unhideWhenUsed="1"/>
+    <w:lsdException w:name="Table List 7" w:semiHidden="1" w:unhideWhenUsed="1"/>
+    <w:lsdException w:name="Table List 8" w:semiHidden="1" w:unhideWhenUsed="1"/>
+    <w:lsdException w:name="Table 3D effects 1" w:semiHidden="1" w:unhideWhenUsed="1"/>
+    <w:lsdException w:name="Table 3D effects 2" w:semiHidden="1" w:unhideWhenUsed="1"/>
+    <w:lsdException w:name="Table 3D effects 3" w:semiHidden="1" w:unhideWhenUsed="1"/>
+    <w:lsdException w:name="Table Contemporary" w:semiHidden="1" w:unhideWhenUsed="1"/>
+    <w:lsdException w:name="Table Elegant" w:semiHidden="1" w:unhideWhenUsed="1"/>
+    <w:lsdException w:name="Table Professional" w:semiHidden="1" w:unhideWhenUsed="1"/>
+    <w:lsdException w:name="Table Subtle 1" w:semiHidden="1" w:unhideWhenUsed="1"/>
+    <w:lsdException w:name="Table Subtle 2" w:semiHidden="1" w:unhideWhenUsed="1"/>
+    <w:lsdException w:name="Table Web 1" w:semiHidden="1" w:unhideWhenUsed="1"/>
+    <w:lsdException w:name="Table Web 2" w:semiHidden="1" w:unhideWhenUsed="1"/>
+    <w:lsdException w:name="Table Web 3" w:semiHidden="1" w:unhideWhenUsed="1"/>
+    <w:lsdException w:name="Balloon Text" w:semiHidden="1" w:unhideWhenUsed="1"/>
+    <w:lsdException w:name="Table Grid" w:uiPriority="39"/>
+    <w:lsdException w:name="Table Theme" w:semiHidden="1" w:unhideWhenUsed="1"/>
+    <w:lsdException w:name="Placeholder Text" w:semiHidden="1"/>
+    <w:lsdException w:name="No Spacing" w:uiPriority="1" w:qFormat="1"/>
+    <w:lsdException w:name="Light Shading" w:uiPriority="60"/>
+    <w:lsdException w:name="Light List" w:uiPriority="61"/>
+    <w:lsdException w:name="Light Grid" w:uiPriority="62"/>
+    <w:lsdException w:name="Medium Shading 1" w:uiPriority="63"/>
+    <w:lsdException w:name="Medium Shading 2" w:uiPriority="64"/>
+    <w:lsdException w:name="Medium List 1" w:uiPriority="65"/>
+    <w:lsdException w:name="Medium List 2" w:uiPriority="66"/>
+    <w:lsdException w:name="Medium Grid 1" w:uiPriority="67"/>
+    <w:lsdException w:name="Medium Grid 2" w:uiPriority="68"/>
+    <w:lsdException w:name="Medium Grid 3" w:uiPriority="69"/>
+    <w:lsdException w:name="Dark List" w:uiPriority="70"/>
+    <w:lsdException w:name="Colorful Shading" w:uiPriority="71"/>
+    <w:lsdException w:name="Colorful List" w:uiPriority="72"/>
+    <w:lsdException w:name="Colorful Grid" w:uiPriority="73"/>
+    <w:lsdException w:name="Light Shading Accent 1" w:uiPriority="60"/>
+    <w:lsdException w:name="Light List Accent 1" w:uiPriority="61"/>
+    <w:lsdException w:name="Light Grid Accent 1" w:uiPriority="62"/>
+    <w:lsdException w:name="Medium Shading 1 Accent 1" w:uiPriority="63"/>
+    <w:lsdException w:name="Medium Shading 2 Accent 1" w:uiPriority="64"/>
+    <w:lsdException w:name="Medium List 1 Accent 1" w:uiPriority="65"/>
+    <w:lsdException w:name="Revision" w:semiHidden="1"/>
+    <w:lsdException w:name="List Paragraph" w:uiPriority="34" w:qFormat="1"/>
+    <w:lsdException w:name="Quote" w:uiPriority="29" w:qFormat="1"/>
+    <w:lsdException w:name="Intense Quote" w:uiPriority="30" w:qFormat="1"/>
+    <w:lsdException w:name="Medium List 2 Accent 1" w:uiPriority="66"/>
+    <w:lsdException w:name="Medium Grid 1 Accent 1" w:uiPriority="67"/>
+    <w:lsdException w:name="Medium Grid 2 Accent 1" w:uiPriority="68"/>
+    <w:lsdException w:name="Medium Grid 3 Accent 1" w:uiPriority="69"/>
+    <w:lsdException w:name="Dark List Accent 1" w:uiPriority="70"/>
+    <w:lsdException w:name="Colorful Shading Accent 1" w:uiPriority="71"/>
+    <w:lsdException w:name="Colorful List Accent 1" w:uiPriority="72"/>
+    <w:lsdException w:name="Colorful Grid Accent 1" w:uiPriority="73"/>
+    <w:lsdException w:name="Light Shading Accent 2" w:uiPriority="60"/>
+    <w:lsdException w:name="Light List Accent 2" w:uiPriority="61"/>
+    <w:lsdException w:name="Light Grid Accent 2" w:uiPriority="62"/>
+    <w:lsdException w:name="Medium Shading 1 Accent 2" w:uiPriority="63"/>
+    <w:lsdException w:name="Medium Shading 2 Accent 2" w:uiPriority="64"/>
+    <w:lsdException w:name="Medium List 1 Accent 2" w:uiPriority="65"/>
+    <w:lsdException w:name="Medium List 2 Accent 2" w:uiPriority="66"/>
+    <w:lsdException w:name="Medium Grid 1 Accent 2" w:uiPriority="67"/>
+    <w:lsdException w:name="Medium Grid 2 Accent 2" w:uiPriority="68"/>
+    <w:lsdException w:name="Medium Grid 3 Accent 2" w:uiPriority="69"/>
+    <w:lsdException w:name="Dark List Accent 2" w:uiPriority="70"/>
+    <w:lsdException w:name="Colorful Shading Accent 2" w:uiPriority="71"/>
+    <w:lsdException w:name="Colorful List Accent 2" w:uiPriority="72"/>
+    <w:lsdException w:name="Colorful Grid Accent 2" w:uiPriority="73"/>
+    <w:lsdException w:name="Light Shading Accent 3" w:uiPriority="60"/>
+    <w:lsdException w:name="Light List Accent 3" w:uiPriority="61"/>
+    <w:lsdException w:name="Light Grid Accent 3" w:uiPriority="62"/>
+    <w:lsdException w:name="Medium Shading 1 Accent 3" w:uiPriority="63"/>
+    <w:lsdException w:name="Medium Shading 2 Accent 3" w:uiPriority="64"/>
+    <w:lsdException w:name="Medium List 1 Accent 3" w:uiPriority="65"/>
+    <w:lsdException w:name="Medium List 2 Accent 3" w:uiPriority="66"/>
+    <w:lsdException w:name="Medium Grid 1 Accent 3" w:uiPriority="67"/>
+    <w:lsdException w:name="Medium Grid 2 Accent 3" w:uiPriority="68"/>
+    <w:lsdException w:name="Medium Grid 3 Accent 3" w:uiPriority="69"/>
+    <w:lsdException w:name="Dark List Accent 3" w:uiPriority="70"/>
+    <w:lsdException w:name="Colorful Shading Accent 3" w:uiPriority="71"/>
+    <w:lsdException w:name="Colorful List Accent 3" w:uiPriority="72"/>
+    <w:lsdException w:name="Colorful Grid Accent 3" w:uiPriority="73"/>
+    <w:lsdException w:name="Light Shading Accent 4" w:uiPriority="60"/>
+    <w:lsdException w:name="Light List Accent 4" w:uiPriority="61"/>
+    <w:lsdException w:name="Light Grid Accent 4" w:uiPriority="62"/>
+    <w:lsdException w:name="Medium Shading 1 Accent 4" w:uiPriority="63"/>
+    <w:lsdException w:name="Medium Shading 2 Accent 4" w:uiPriority="64"/>
+    <w:lsdException w:name="Medium List 1 Accent 4" w:uiPriority="65"/>
+    <w:lsdException w:name="Medium List 2 Accent 4" w:uiPriority="66"/>
+    <w:lsdException w:name="Medium Grid 1 Accent 4" w:uiPriority="67"/>
+    <w:lsdException w:name="Medium Grid 2 Accent 4" w:uiPriority="68"/>
+    <w:lsdException w:name="Medium Grid 3 Accent 4" w:uiPriority="69"/>
+    <w:lsdException w:name="Dark List Accent 4" w:uiPriority="70"/>
+    <w:lsdException w:name="Colorful Shading Accent 4" w:uiPriority="71"/>
+    <w:lsdException w:name="Colorful List Accent 4" w:uiPriority="72"/>
+    <w:lsdException w:name="Colorful Grid Accent 4" w:uiPriority="73"/>
+    <w:lsdException w:name="Light Shading Accent 5" w:uiPriority="60"/>
+    <w:lsdException w:name="Light List Accent 5" w:uiPriority="61"/>
+    <w:lsdException w:name="Light Grid Accent 5" w:uiPriority="62"/>
+    <w:lsdException w:name="Medium Shading 1 Accent 5" w:uiPriority="63"/>
+    <w:lsdException w:name="Medium Shading 2 Accent 5" w:uiPriority="64"/>
+    <w:lsdException w:name="Medium List 1 Accent 5" w:uiPriority="65"/>
+    <w:lsdException w:name="Medium List 2 Accent 5" w:uiPriority="66"/>
+    <w:lsdException w:name="Medium Grid 1 Accent 5" w:uiPriority="67"/>
+    <w:lsdException w:name="Medium Grid 2 Accent 5" w:uiPriority="68"/>
+    <w:lsdException w:name="Medium Grid 3 Accent 5" w:uiPriority="69"/>
+    <w:lsdException w:name="Dark List Accent 5" w:uiPriority="70"/>
+    <w:lsdException w:name="Colorful Shading Accent 5" w:uiPriority="71"/>
+    <w:lsdException w:name="Colorful List Accent 5" w:uiPriority="72"/>
+    <w:lsdException w:name="Colorful Grid Accent 5" w:uiPriority="73"/>
+    <w:lsdException w:name="Light Shading Accent 6" w:uiPriority="60"/>
+    <w:lsdException w:name="Light List Accent 6" w:uiPriority="61"/>
+    <w:lsdException w:name="Light Grid Accent 6" w:uiPriority="62"/>
+    <w:lsdException w:name="Medium Shading 1 Accent 6" w:uiPriority="63"/>
+    <w:lsdException w:name="Medium Shading 2 Accent 6" w:uiPriority="64"/>
+    <w:lsdException w:name="Medium List 1 Accent 6" w:uiPriority="65"/>
+    <w:lsdException w:name="Medium List 2 Accent 6" w:uiPriority="66"/>
+    <w:lsdException w:name="Medium Grid 1 Accent 6" w:uiPriority="67"/>
+    <w:lsdException w:name="Medium Grid 2 Accent 6" w:uiPriority="68"/>
+    <w:lsdException w:name="Medium Grid 3 Accent 6" w:uiPriority="69"/>
+    <w:lsdException w:name="Dark List Accent 6" w:uiPriority="70"/>
+    <w:lsdException w:name="Colorful Shading Accent 6" w:uiPriority="71"/>
+    <w:lsdException w:name="Colorful List Accent 6" w:uiPriority="72"/>
+    <w:lsdException w:name="Colorful Grid Accent 6" w:uiPriority="73"/>
+    <w:lsdException w:name="Subtle Emphasis" w:uiPriority="19" w:qFormat="1"/>
+    <w:lsdException w:name="Intense Emphasis" w:uiPriority="21" w:qFormat="1"/>
+    <w:lsdException w:name="Subtle Reference" w:uiPriority="31" w:qFormat="1"/>
+    <w:lsdException w:name="Intense Reference" w:uiPriority="32" w:qFormat="1"/>
+    <w:lsdException w:name="Book Title" w:uiPriority="33" w:qFormat="1"/>
+    <w:lsdException w:name="Bibliography" w:semiHidden="1" w:uiPriority="37" w:unhideWhenUsed="1"/>
+    <w:lsdException w:name="TOC Heading" w:semiHidden="1" w:uiPriority="39" w:unhideWhenUsed="1" w:qFormat="1"/>
+    <w:lsdException w:name="Plain Table 1" w:uiPriority="41"/>
+    <w:lsdException w:name="Plain Table 2" w:uiPriority="42"/>
+    <w:lsdException w:name="Plain Table 3" w:uiPriority="43"/>
+    <w:lsdException w:name="Plain Table 4" w:uiPriority="44"/>
+    <w:lsdException w:name="Plain Table 5" w:uiPriority="45"/>
+    <w:lsdException w:name="Grid Table Light" w:uiPriority="40"/>
+    <w:lsdException w:name="Grid Table 1 Light" w:uiPriority="46"/>
+    <w:lsdException w:name="Grid Table 2" w:uiPriority="47"/>
+    <w:lsdException w:name="Grid Table 3" w:uiPriority="48"/>
+    <w:lsdException w:name="Grid Table 4" w:uiPriority="49"/>
+    <w:lsdException w:name="Grid Table 5 Dark" w:uiPriority="50"/>
+    <w:lsdException w:name="Grid Table 6 Colorful" w:uiPriority="51"/>
+    <w:lsdException w:name="Grid Table 7 Colorful" w:uiPriority="52"/>
+    <w:lsdException w:name="Grid Table 1 Light Accent 1" w:uiPriority="46"/>
+    <w:lsdException w:name="Grid Table 2 Accent 1" w:uiPriority="47"/>
+    <w:lsdException w:name="Grid Table 3 Accent 1" w:uiPriority="48"/>
+    <w:lsdException w:name="Grid Table 4 Accent 1" w:uiPriority="49"/>
+    <w:lsdException w:name="Grid Table 5 Dark Accent 1" w:uiPriority="50"/>
+    <w:lsdException w:name="Grid Table 6 Colorful Accent 1" w:uiPriority="51"/>
+    <w:lsdException w:name="Grid Table 7 Colorful Accent 1" w:uiPriority="52"/>
+    <w:lsdException w:name="Grid Table 1 Light Accent 2" w:uiPriority="46"/>
+    <w:lsdException w:name="Grid Table 2 Accent 2" w:uiPriority="47"/>
+    <w:lsdException w:name="Grid Table 3 Accent 2" w:uiPriority="48"/>
+    <w:lsdException w:name="Grid Table 4 Accent 2" w:uiPriority="49"/>
+    <w:lsdException w:name="Grid Table 5 Dark Accent 2" w:uiPriority="50"/>
+    <w:lsdException w:name="Grid Table 6 Colorful Accent 2" w:uiPriority="51"/>
+    <w:lsdException w:name="Grid Table 7 Colorful Accent 2" w:uiPriority="52"/>
+    <w:lsdException w:name="Grid Table 1 Light Accent 3" w:uiPriority="46"/>
+    <w:lsdException w:name="Grid Table 2 Accent 3" w:uiPriority="47"/>
+    <w:lsdException w:name="Grid Table 3 Accent 3" w:uiPriority="48"/>
+    <w:lsdException w:name="Grid Table 4 Accent 3" w:uiPriority="49"/>
+    <w:lsdException w:name="Grid Table 5 Dark Accent 3" w:uiPriority="50"/>
+    <w:lsdException w:name="Grid Table 6 Colorful Accent 3" w:uiPriority="51"/>
+    <w:lsdException w:name="Grid Table 7 Colorful Accent 3" w:uiPriority="52"/>
+    <w:lsdException w:name="Grid Table 1 Light Accent 4" w:uiPriority="46"/>
+    <w:lsdException w:name="Grid Table 2 Accent 4" w:uiPriority="47"/>
+    <w:lsdException w:name="Grid Table 3 Accent 4" w:uiPriority="48"/>
+    <w:lsdException w:name="Grid Table 4 Accent 4" w:uiPriority="49"/>
+    <w:lsdException w:name="Grid Table 5 Dark Accent 4" w:uiPriority="50"/>
+    <w:lsdException w:name="Grid Table 6 Colorful Accent 4" w:uiPriority="51"/>
+    <w:lsdException w:name="Grid Table 7 Colorful Accent 4" w:uiPriority="52"/>
+    <w:lsdException w:name="Grid Table 1 Light Accent 5" w:uiPriority="46"/>
+    <w:lsdException w:name="Grid Table 2 Accent 5" w:uiPriority="47"/>
+    <w:lsdException w:name="Grid Table 3 Accent 5" w:uiPriority="48"/>
+    <w:lsdException w:name="Grid Table 4 Accent 5" w:uiPriority="49"/>
+    <w:lsdException w:name="Grid Table 5 Dark Accent 5" w:uiPriority="50"/>
+    <w:lsdException w:name="Grid Table 6 Colorful Accent 5" w:uiPriority="51"/>
+    <w:lsdException w:name="Grid Table 7 Colorful Accent 5" w:uiPriority="52"/>
+    <w:lsdException w:name="Grid Table 1 Light Accent 6" w:uiPriority="46"/>
+    <w:lsdException w:name="Grid Table 2 Accent 6" w:uiPriority="47"/>
+    <w:lsdException w:name="Grid Table 3 Accent 6" w:uiPriority="48"/>
+    <w:lsdException w:name="Grid Table 4 Accent 6" w:uiPriority="49"/>
+    <w:lsdException w:name="Grid Table 5 Dark Accent 6" w:uiPriority="50"/>
+    <w:lsdException w:name="Grid Table 6 Colorful Accent 6" w:uiPriority="51"/>
+    <w:lsdException w:name="Grid Table 7 Colorful Accent 6" w:uiPriority="52"/>
+    <w:lsdException w:name="List Table 1 Light" w:uiPriority="46"/>
+    <w:lsdException w:name="List Table 2" w:uiPriority="47"/>
+    <w:lsdException w:name="List Table 3" w:uiPriority="48"/>
+    <w:lsdException w:name="List Table 4" w:uiPriority="49"/>
+    <w:lsdException w:name="List Table 5 Dark" w:uiPriority="50"/>
+    <w:lsdException w:name="List Table 6 Colorful" w:uiPriority="51"/>
+    <w:lsdException w:name="List Table 7 Colorful" w:uiPriority="52"/>
+    <w:lsdException w:name="List Table 1 Light Accent 1" w:uiPriority="46"/>
+    <w:lsdException w:name="List Table 2 Accent 1" w:uiPriority="47"/>
+    <w:lsdException w:name="List Table 3 Accent 1" w:uiPriority="48"/>
+    <w:lsdException w:name="List Table 4 Accent 1" w:uiPriority="49"/>
+    <w:lsdException w:name="List Table 5 Dark Accent 1" w:uiPriority="50"/>
+    <w:lsdException w:name="List Table 6 Colorful Accent 1" w:uiPriority="51"/>
+    <w:lsdException w:name="List Table 7 Colorful Accent 1" w:uiPriority="52"/>
+    <w:lsdException w:name="List Table 1 Light Accent 2" w:uiPriority="46"/>
+    <w:lsdException w:name="List Table 2 Accent 2" w:uiPriority="47"/>
+    <w:lsdException w:name="List Table 3 Accent 2" w:uiPriority="48"/>
+    <w:lsdException w:name="List Table 4 Accent 2" w:uiPriority="49"/>
+    <w:lsdException w:name="List Table 5 Dark Accent 2" w:uiPriority="50"/>
+    <w:lsdException w:name="List Table 6 Colorful Accent 2" w:uiPriority="51"/>
+    <w:lsdException w:name="List Table 7 Colorful Accent 2" w:uiPriority="52"/>
+    <w:lsdException w:name="List Table 1 Light Accent 3" w:uiPriority="46"/>
+    <w:lsdException w:name="List Table 2 Accent 3" w:uiPriority="47"/>
+    <w:lsdException w:name="List Table 3 Accent 3" w:uiPriority="48"/>
+    <w:lsdException w:name="List Table 4 Accent 3" w:uiPriority="49"/>
+    <w:lsdException w:name="List Table 5 Dark Accent 3" w:uiPriority="50"/>
+    <w:lsdException w:name="List Table 6 Colorful Accent 3" w:uiPriority="51"/>
+    <w:lsdException w:name="List Table 7 Colorful Accent 3" w:uiPriority="52"/>
+    <w:lsdException w:name="List Table 1 Light Accent 4" w:uiPriority="46"/>
+    <w:lsdException w:name="List Table 2 Accent 4" w:uiPriority="47"/>
+    <w:lsdException w:name="List Table 3 Accent 4" w:uiPriority="48"/>
+    <w:lsdException w:name="List Table 4 Accent 4" w:uiPriority="49"/>
+    <w:lsdException w:name="List Table 5 Dark Accent 4" w:uiPriority="50"/>
+    <w:lsdException w:name="List Table 6 Colorful Accent 4" w:uiPriority="51"/>
+    <w:lsdException w:name="List Table 7 Colorful Accent 4" w:uiPriority="52"/>
+    <w:lsdException w:name="List Table 1 Light Accent 5" w:uiPriority="46"/>
+    <w:lsdException w:name="List Table 2 Accent 5" w:uiPriority="47"/>
+    <w:lsdException w:name="List Table 3 Accent 5" w:uiPriority="48"/>
+    <w:lsdException w:name="List Table 4 Accent 5" w:uiPriority="49"/>
+    <w:lsdException w:name="List Table 5 Dark Accent 5" w:uiPriority="50"/>
+    <w:lsdException w:name="List Table 6 Colorful Accent 5" w:uiPriority="51"/>
+    <w:lsdException w:name="List Table 7 Colorful Accent 5" w:uiPriority="52"/>
+    <w:lsdException w:name="List Table 1 Light Accent 6" w:uiPriority="46"/>
+    <w:lsdException w:name="List Table 2 Accent 6" w:uiPriority="47"/>
+    <w:lsdException w:name="List Table 3 Accent 6" w:uiPriority="48"/>
+    <w:lsdException w:name="List Table 4 Accent 6" w:uiPriority="49"/>
+    <w:lsdException w:name="List Table 5 Dark Accent 6" w:uiPriority="50"/>
+    <w:lsdException w:name="List Table 6 Colorful Accent 6" w:uiPriority="51"/>
+    <w:lsdException w:name="List Table 7 Colorful Accent 6" w:uiPriority="52"/>
+    <w:lsdException w:name="Mention" w:semiHidden="1" w:unhideWhenUsed="1"/>
+    <w:lsdException w:name="Smart Hyperlink" w:semiHidden="1" w:unhideWhenUsed="1"/>
+    <w:lsdException w:name="Hashtag" w:semiHidden="1" w:unhideWhenUsed="1"/>
+    <w:lsdException w:name="Unresolved Mention" w:semiHidden="1" w:unhideWhenUsed="1"/>
+    <w:lsdException w:name="Smart Link" w:semiHidden="1" w:unhideWhenUsed="1"/>
+  </w:latentStyles>
+  <w:style w:type="paragraph" w:default="1" w:styleId="Normal">
     <w:name w:val="Normal"/>
     <w:qFormat/>
   </w:style>
-  <w:style w:type="table" w:styleId="TableNormal" w:default="true">
+  <w:style w:type="paragraph" w:styleId="Heading1">
+    <w:name w:val="heading 1"/>
+    <w:basedOn w:val="Normal"/>
+    <w:next w:val="Normal"/>
+    <w:uiPriority w:val="9"/>
+    <w:qFormat/>
+    <w:pPr>
+      <w:outlineLvl w:val="0"/>
+    </w:pPr>
+    <w:rPr>
+      <w:color w:val="2E74B5"/>
+      <w:sz w:val="32"/>
+      <w:szCs w:val="32"/>
+    </w:rPr>
+  </w:style>
+  <w:style w:type="paragraph" w:styleId="Heading2">
+    <w:name w:val="heading 2"/>
+    <w:basedOn w:val="Normal"/>
+    <w:next w:val="Normal"/>
+    <w:uiPriority w:val="9"/>
+    <w:unhideWhenUsed/>
+    <w:qFormat/>
+    <w:pPr>
+      <w:outlineLvl w:val="1"/>
+    </w:pPr>
+    <w:rPr>
+      <w:color w:val="2E74B5"/>
+      <w:sz w:val="26"/>
+      <w:szCs w:val="26"/>
+    </w:rPr>
+  </w:style>
+  <w:style w:type="paragraph" w:styleId="Heading3">
+    <w:name w:val="heading 3"/>
+    <w:basedOn w:val="Normal"/>
+    <w:next w:val="Normal"/>
+    <w:uiPriority w:val="9"/>
+    <w:semiHidden/>
+    <w:unhideWhenUsed/>
+    <w:qFormat/>
+    <w:pPr>
+      <w:outlineLvl w:val="2"/>
+    </w:pPr>
+    <w:rPr>
+      <w:color w:val="1F4D78"/>
+      <w:sz w:val="24"/>
+      <w:szCs w:val="24"/>
+    </w:rPr>
+  </w:style>
+  <w:style w:type="paragraph" w:styleId="Heading4">
+    <w:name w:val="heading 4"/>
+    <w:basedOn w:val="Normal"/>
+    <w:next w:val="Normal"/>
+    <w:uiPriority w:val="9"/>
+    <w:semiHidden/>
+    <w:unhideWhenUsed/>
+    <w:qFormat/>
+    <w:pPr>
+      <w:outlineLvl w:val="3"/>
+    </w:pPr>
+    <w:rPr>
+      <w:i/>
+      <w:iCs/>
+      <w:color w:val="2E74B5"/>
+    </w:rPr>
+  </w:style>
+  <w:style w:type="paragraph" w:styleId="Heading5">
+    <w:name w:val="heading 5"/>
+    <w:basedOn w:val="Normal"/>
+    <w:next w:val="Normal"/>
+    <w:uiPriority w:val="9"/>
+    <w:semiHidden/>
+    <w:unhideWhenUsed/>
+    <w:qFormat/>
+    <w:pPr>
+      <w:outlineLvl w:val="4"/>
+    </w:pPr>
+    <w:rPr>
+      <w:color w:val="2E74B5"/>
+    </w:rPr>
+  </w:style>
+  <w:style w:type="paragraph" w:styleId="Heading6">
+    <w:name w:val="heading 6"/>
+    <w:basedOn w:val="Normal"/>
+    <w:next w:val="Normal"/>
+    <w:uiPriority w:val="9"/>
+    <w:semiHidden/>
+    <w:unhideWhenUsed/>
+    <w:qFormat/>
+    <w:pPr>
+      <w:outlineLvl w:val="5"/>
+    </w:pPr>
+    <w:rPr>
+      <w:color w:val="1F4D78"/>
+    </w:rPr>
+  </w:style>
+  <w:style w:type="character" w:default="1" w:styleId="DefaultParagraphFont">
+    <w:name w:val="Default Paragraph Font"/>
+    <w:uiPriority w:val="1"/>
+    <w:semiHidden/>
+    <w:unhideWhenUsed/>
+  </w:style>
+  <w:style w:type="table" w:default="1" w:styleId="TableNormal">
     <w:name w:val="Normal Table"/>
     <w:uiPriority w:val="99"/>
     <w:semiHidden/>
     <w:unhideWhenUsed/>
     <w:tblPr>
-      <w:tblInd w:type="dxa" w:w="0"/>
+      <w:tblInd w:w="0" w:type="dxa"/>
       <w:tblCellMar>
-        <w:top w:type="dxa" w:w="0"/>
-        <w:left w:type="dxa" w:w="108"/>
-        <w:bottom w:type="dxa" w:w="0"/>
-        <w:right w:type="dxa" w:w="108"/>
+        <w:top w:w="0" w:type="dxa"/>
+        <w:left w:w="108" w:type="dxa"/>
+        <w:bottom w:w="0" w:type="dxa"/>
+        <w:right w:w="108" w:type="dxa"/>
       </w:tblCellMar>
     </w:tblPr>
+  </w:style>
+  <w:style w:type="numbering" w:default="1" w:styleId="NoList">
+    <w:name w:val="No List"/>
+    <w:uiPriority w:val="99"/>
+    <w:semiHidden/>
+    <w:unhideWhenUsed/>
   </w:style>
   <w:style w:type="paragraph" w:styleId="Title">
     <w:name w:val="Title"/>
     <w:basedOn w:val="Normal"/>
     <w:next w:val="Normal"/>
+    <w:uiPriority w:val="10"/>
     <w:qFormat/>
     <w:rPr>
       <w:sz w:val="56"/>
       <w:szCs w:val="56"/>
     </w:rPr>
   </w:style>
-  <w:style w:type="paragraph" w:styleId="Heading1">
-    <w:name w:val="Heading 1"/>
-    <w:basedOn w:val="Normal"/>
-    <w:next w:val="Normal"/>
-    <w:qFormat/>
-    <w:rPr>
-      <w:color w:val="2E74B5"/>
-      <w:sz w:val="32"/>
-      <w:szCs w:val="32"/>
-    </w:rPr>
-  </w:style>
-  <w:style w:type="paragraph" w:styleId="Heading2">
-    <w:name w:val="Heading 2"/>
-    <w:basedOn w:val="Normal"/>
-    <w:next w:val="Normal"/>
-    <w:qFormat/>
-    <w:rPr>
-      <w:color w:val="2E74B5"/>
-      <w:sz w:val="26"/>
-      <w:szCs w:val="26"/>
-    </w:rPr>
-  </w:style>
-  <w:style w:type="paragraph" w:styleId="Heading3">
-    <w:name w:val="Heading 3"/>
-    <w:basedOn w:val="Normal"/>
-    <w:next w:val="Normal"/>
-    <w:qFormat/>
-    <w:rPr>
-      <w:color w:val="1F4D78"/>
-      <w:sz w:val="24"/>
-      <w:szCs w:val="24"/>
-    </w:rPr>
-  </w:style>
-  <w:style w:type="paragraph" w:styleId="Heading4">
-    <w:name w:val="Heading 4"/>
-    <w:basedOn w:val="Normal"/>
-    <w:next w:val="Normal"/>
-    <w:qFormat/>
-    <w:rPr>
-      <w:i/>
-      <w:iCs/>
-      <w:color w:val="2E74B5"/>
-    </w:rPr>
-  </w:style>
-  <w:style w:type="paragraph" w:styleId="Heading5">
-    <w:name w:val="Heading 5"/>
-    <w:basedOn w:val="Normal"/>
-    <w:next w:val="Normal"/>
-    <w:qFormat/>
-    <w:rPr>
-      <w:color w:val="2E74B5"/>
-    </w:rPr>
-  </w:style>
-  <w:style w:type="paragraph" w:styleId="Heading6">
-    <w:name w:val="Heading 6"/>
-    <w:basedOn w:val="Normal"/>
-    <w:next w:val="Normal"/>
-    <w:qFormat/>
-    <w:rPr>
-      <w:color w:val="1F4D78"/>
-    </w:rPr>
-  </w:style>
-  <w:style w:type="paragraph" w:styleId="Strong">
-    <w:name w:val="Strong"/>
+  <w:style w:type="paragraph" w:customStyle="1" w:styleId="Strong1">
+    <w:name w:val="Strong1"/>
     <w:basedOn w:val="Normal"/>
     <w:next w:val="Normal"/>
     <w:qFormat/>
@@ -2028,7 +2388,6 @@
   </w:style>
   <w:style w:type="character" w:styleId="Hyperlink">
     <w:name w:val="Hyperlink"/>
-    <w:basedOn w:val="DefaultParagraphFont"/>
     <w:uiPriority w:val="99"/>
     <w:unhideWhenUsed/>
     <w:rPr>
@@ -2038,7 +2397,6 @@
   </w:style>
   <w:style w:type="character" w:styleId="FootnoteReference">
     <w:name w:val="footnote reference"/>
-    <w:basedOn w:val="DefaultParagraphFont"/>
     <w:uiPriority w:val="99"/>
     <w:semiHidden/>
     <w:unhideWhenUsed/>
@@ -2053,17 +2411,13 @@
     <w:uiPriority w:val="99"/>
     <w:semiHidden/>
     <w:unhideWhenUsed/>
-    <w:pPr>
-      <w:spacing w:after="0" w:line="240" w:lineRule="auto"/>
-    </w:pPr>
     <w:rPr>
       <w:sz w:val="20"/>
       <w:szCs w:val="20"/>
     </w:rPr>
   </w:style>
-  <w:style w:type="character" w:styleId="FootnoteTextChar">
+  <w:style w:type="character" w:customStyle="1" w:styleId="FootnoteTextChar">
     <w:name w:val="Footnote Text Char"/>
-    <w:basedOn w:val="DefaultParagraphFont"/>
     <w:link w:val="FootnoteText"/>
     <w:uiPriority w:val="99"/>
     <w:semiHidden/>
@@ -2075,7 +2429,6 @@
   </w:style>
   <w:style w:type="character" w:styleId="EndnoteReference">
     <w:name w:val="endnote reference"/>
-    <w:basedOn w:val="DefaultParagraphFont"/>
     <w:uiPriority w:val="99"/>
     <w:semiHidden/>
     <w:unhideWhenUsed/>
@@ -2090,17 +2443,13 @@
     <w:uiPriority w:val="99"/>
     <w:semiHidden/>
     <w:unhideWhenUsed/>
-    <w:pPr>
-      <w:spacing w:after="0" w:line="240" w:lineRule="auto"/>
-    </w:pPr>
     <w:rPr>
       <w:sz w:val="20"/>
       <w:szCs w:val="20"/>
     </w:rPr>
   </w:style>
-  <w:style w:type="character" w:styleId="EndnoteTextChar">
+  <w:style w:type="character" w:customStyle="1" w:styleId="EndnoteTextChar">
     <w:name w:val="Endnote Text Char"/>
-    <w:basedOn w:val="DefaultParagraphFont"/>
     <w:link w:val="EndnoteText"/>
     <w:uiPriority w:val="99"/>
     <w:semiHidden/>
@@ -2112,7 +2461,6 @@
   </w:style>
   <w:style w:type="character" w:styleId="LineNumber">
     <w:name w:val="line number"/>
-    <w:basedOn w:val="DefaultParagraphFont"/>
     <w:uiPriority w:val="99"/>
     <w:semiHidden/>
     <w:unhideWhenUsed/>
@@ -2272,7 +2620,7 @@
         <a:solidFill>
           <a:schemeClr val="phClr"/>
         </a:solidFill>
-        <a:gradFill rotWithShape="true">
+        <a:gradFill rotWithShape="1">
           <a:gsLst>
             <a:gs pos="0">
               <a:schemeClr val="phClr">
@@ -2296,9 +2644,9 @@
               </a:schemeClr>
             </a:gs>
           </a:gsLst>
-          <a:lin ang="5400000" scaled="false"/>
+          <a:lin ang="5400000" scaled="0"/>
         </a:gradFill>
-        <a:gradFill rotWithShape="true">
+        <a:gradFill rotWithShape="1">
           <a:gsLst>
             <a:gs pos="0">
               <a:schemeClr val="phClr">
@@ -2322,7 +2670,7 @@
               </a:schemeClr>
             </a:gs>
           </a:gsLst>
-          <a:lin ang="5400000" scaled="false"/>
+          <a:lin ang="5400000" scaled="0"/>
         </a:gradFill>
       </a:fillStyleLst>
       <a:lnStyleLst>
@@ -2357,7 +2705,7 @@
         </a:effectStyle>
         <a:effectStyle>
           <a:effectLst>
-            <a:outerShdw blurRad="57150" dist="19050" dir="5400000" algn="ctr" rotWithShape="false">
+            <a:outerShdw blurRad="57150" dist="19050" dir="5400000" algn="ctr" rotWithShape="0">
               <a:srgbClr val="000000">
                 <a:alpha val="63000"/>
               </a:srgbClr>
@@ -2375,7 +2723,7 @@
             <a:satMod val="170000"/>
           </a:schemeClr>
         </a:solidFill>
-        <a:gradFill rotWithShape="true">
+        <a:gradFill rotWithShape="1">
           <a:gsLst>
             <a:gs pos="0">
               <a:schemeClr val="phClr">
@@ -2400,7 +2748,7 @@
               </a:schemeClr>
             </a:gs>
           </a:gsLst>
-          <a:lin ang="5400000" scaled="false"/>
+          <a:lin ang="5400000" scaled="0"/>
         </a:gradFill>
       </a:bgFillStyleLst>
     </a:fmtScheme>

</xml_diff>